<commit_message>
docs: align deliverables with revised use cases and fix doc 3
- Standardize typography in Document 3 (Arial, RF to 8.5 pt, RNF/RN to 8.0 pt)

- Eliminate inconsistent font sizes and style fallbacks across tables

- Synchronize use case names and actors across Documents 1, 2, and 3

- Update AN06 to 'Consultar ajuda do exercício' across Document 2

- Align PlantUML diagram sources and current baseline script
</commit_message>
<xml_diff>
--- a/docs/laboratorio-engenharia-software/entregaveis/02-atividades-do-negocio-stacklyst-corrigido.docx
+++ b/docs/laboratorio-engenharia-software/entregaveis/02-atividades-do-negocio-stacklyst-corrigido.docx
@@ -1,6 +1,6 @@
 
 <file path=word/document.xml><?xml version="1.0" encoding="utf-8"?>
-<w:document xmlns:wpc="http://schemas.microsoft.com/office/word/2010/wordprocessingCanvas" xmlns:cx="http://schemas.microsoft.com/office/drawing/2014/chartex" xmlns:cx1="http://schemas.microsoft.com/office/drawing/2015/9/8/chartex" xmlns:cx2="http://schemas.microsoft.com/office/drawing/2015/10/21/chartex" xmlns:cx3="http://schemas.microsoft.com/office/drawing/2016/5/9/chartex" xmlns:cx4="http://schemas.microsoft.com/office/drawing/2016/5/10/chartex" xmlns:cx5="http://schemas.microsoft.com/office/drawing/2016/5/11/chartex" xmlns:cx6="http://schemas.microsoft.com/office/drawing/2016/5/12/chartex" xmlns:cx7="http://schemas.microsoft.com/office/drawing/2016/5/13/chartex" xmlns:cx8="http://schemas.microsoft.com/office/drawing/2016/5/14/chartex" xmlns:mc="http://schemas.openxmlformats.org/markup-compatibility/2006" xmlns:aink="http://schemas.microsoft.com/office/drawing/2016/ink" xmlns:am3d="http://schemas.microsoft.com/office/drawing/2017/model3d" xmlns:o="urn:schemas-microsoft-com:office:office" xmlns:oel="http://schemas.microsoft.com/office/2019/extlst" xmlns:r="http://schemas.openxmlformats.org/officeDocument/2006/relationships" xmlns:m="http://schemas.openxmlformats.org/officeDocument/2006/math" xmlns:v="urn:schemas-microsoft-com:vml" xmlns:wp14="http://schemas.microsoft.com/office/word/2010/wordprocessingDrawing" xmlns:wp="http://schemas.openxmlformats.org/drawingml/2006/wordprocessingDrawing" xmlns:w10="urn:schemas-microsoft-com:office:word" xmlns:w="http://schemas.openxmlformats.org/wordprocessingml/2006/main" xmlns:w14="http://schemas.microsoft.com/office/word/2010/wordml" xmlns:w15="http://schemas.microsoft.com/office/word/2012/wordml" xmlns:w16cex="http://schemas.microsoft.com/office/word/2018/wordml/cex" xmlns:w16cid="http://schemas.microsoft.com/office/word/2016/wordml/cid" xmlns:w16="http://schemas.microsoft.com/office/word/2018/wordml" xmlns:w16sdtdh="http://schemas.microsoft.com/office/word/2020/wordml/sdtdatahash" xmlns:w16se="http://schemas.microsoft.com/office/word/2015/wordml/symex" xmlns:wpg="http://schemas.microsoft.com/office/word/2010/wordprocessingGroup" xmlns:wpi="http://schemas.microsoft.com/office/word/2010/wordprocessingInk" xmlns:wne="http://schemas.microsoft.com/office/word/2006/wordml" xmlns:wps="http://schemas.microsoft.com/office/word/2010/wordprocessingShape" mc:Ignorable="w14 w15 w16se w16cid w16 w16cex w16sdtdh wp14">
+<w:document xmlns:wpc="http://schemas.microsoft.com/office/word/2010/wordprocessingCanvas" xmlns:cx="http://schemas.microsoft.com/office/drawing/2014/chartex" xmlns:cx1="http://schemas.microsoft.com/office/drawing/2015/9/8/chartex" xmlns:cx2="http://schemas.microsoft.com/office/drawing/2015/10/21/chartex" xmlns:cx3="http://schemas.microsoft.com/office/drawing/2016/5/9/chartex" xmlns:cx4="http://schemas.microsoft.com/office/drawing/2016/5/10/chartex" xmlns:cx5="http://schemas.microsoft.com/office/drawing/2016/5/11/chartex" xmlns:cx6="http://schemas.microsoft.com/office/drawing/2016/5/12/chartex" xmlns:cx7="http://schemas.microsoft.com/office/drawing/2016/5/13/chartex" xmlns:cx8="http://schemas.microsoft.com/office/drawing/2016/5/14/chartex" xmlns:mc="http://schemas.openxmlformats.org/markup-compatibility/2006" xmlns:aink="http://schemas.microsoft.com/office/drawing/2016/ink" xmlns:am3d="http://schemas.microsoft.com/office/drawing/2017/model3d" xmlns:o="urn:schemas-microsoft-com:office:office" xmlns:oel="http://schemas.microsoft.com/office/2019/extlst" xmlns:r="http://schemas.openxmlformats.org/officeDocument/2006/relationships" xmlns:m="http://schemas.openxmlformats.org/officeDocument/2006/math" xmlns:v="urn:schemas-microsoft-com:vml" xmlns:wp14="http://schemas.microsoft.com/office/word/2010/wordprocessingDrawing" xmlns:wp="http://schemas.openxmlformats.org/drawingml/2006/wordprocessingDrawing" xmlns:w10="urn:schemas-microsoft-com:office:word" xmlns:w="http://schemas.openxmlformats.org/wordprocessingml/2006/main" xmlns:w14="http://schemas.microsoft.com/office/word/2010/wordml" xmlns:w15="http://schemas.microsoft.com/office/word/2012/wordml" xmlns:w16cex="http://schemas.microsoft.com/office/word/2018/wordml/cex" xmlns:w16cid="http://schemas.microsoft.com/office/word/2016/wordml/cid" xmlns:w16="http://schemas.microsoft.com/office/word/2018/wordml" xmlns:w16du="http://schemas.microsoft.com/office/word/2023/wordml/word16du" xmlns:w16sdtdh="http://schemas.microsoft.com/office/word/2020/wordml/sdtdatahash" xmlns:w16sdtfl="http://schemas.microsoft.com/office/word/2024/wordml/sdtformatlock" xmlns:w16se="http://schemas.microsoft.com/office/word/2015/wordml/symex" xmlns:wpg="http://schemas.microsoft.com/office/word/2010/wordprocessingGroup" xmlns:wpi="http://schemas.microsoft.com/office/word/2010/wordprocessingInk" xmlns:wne="http://schemas.microsoft.com/office/word/2006/wordml" xmlns:wps="http://schemas.microsoft.com/office/word/2010/wordprocessingShape" mc:Ignorable="w14 w15 w16se w16cid w16 w16cex w16sdtdh w16sdtfl w16du wp14">
   <w:body>
     <w:p/>
     <w:p/>
@@ -18,7 +18,7 @@
       <w:r>
         <w:rPr>
           <w:b/>
-          <w:color w:val="000000"/>
+          <w:color w:val="1F4E78"/>
           <w:sz w:val="60"/>
         </w:rPr>
         <w:t>Stacklyst</w:t>
@@ -34,7 +34,7 @@
           <w:i/>
           <w:sz w:val="40"/>
         </w:rPr>
-        <w:t>Atividades do Negócio</w:t>
+        <w:t>Documento de Atividades do Negócio</w:t>
       </w:r>
     </w:p>
     <w:p>
@@ -63,8 +63,11 @@
       <w:pPr>
         <w:pStyle w:val="Ttulo1"/>
       </w:pPr>
-      <w:bookmarkStart w:id="0" w:name="_Toc240103568"/>
-      <w:r>
+      <w:bookmarkStart w:id="0" w:name="_Toc240127466"/>
+      <w:r>
+        <w:rPr>
+          <w:color w:val="1F4E78"/>
+        </w:rPr>
         <w:t>1. Índice</w:t>
       </w:r>
       <w:bookmarkEnd w:id="0"/>
@@ -85,15 +88,24 @@
         </w:rPr>
       </w:pPr>
       <w:r>
+        <w:rPr>
+          <w:sz w:val="20"/>
+        </w:rPr>
         <w:fldChar w:fldCharType="begin"/>
       </w:r>
       <w:r>
+        <w:rPr>
+          <w:sz w:val="20"/>
+        </w:rPr>
         <w:instrText>TOC \o "1-3" \h \z \u</w:instrText>
       </w:r>
       <w:r>
+        <w:rPr>
+          <w:sz w:val="20"/>
+        </w:rPr>
         <w:fldChar w:fldCharType="separate"/>
       </w:r>
-      <w:hyperlink w:anchor="_Toc240103568" w:history="1">
+      <w:hyperlink w:anchor="_Toc240127466" w:history="1">
         <w:r>
           <w:rPr>
             <w:rStyle w:val="Hyperlink"/>
@@ -120,7 +132,7 @@
             <w:noProof/>
             <w:webHidden/>
           </w:rPr>
-          <w:instrText xml:space="preserve"> PAGEREF _Toc240103568 \h </w:instrText>
+          <w:instrText xml:space="preserve"> PAGEREF _Toc240127466 \h </w:instrText>
         </w:r>
         <w:r>
           <w:rPr>
@@ -166,7 +178,7 @@
           <w14:ligatures w14:val="standardContextual"/>
         </w:rPr>
       </w:pPr>
-      <w:hyperlink w:anchor="_Toc240103569" w:history="1">
+      <w:hyperlink w:anchor="_Toc240127467" w:history="1">
         <w:r>
           <w:rPr>
             <w:rStyle w:val="Hyperlink"/>
@@ -193,7 +205,7 @@
             <w:noProof/>
             <w:webHidden/>
           </w:rPr>
-          <w:instrText xml:space="preserve"> PAGEREF _Toc240103569 \h </w:instrText>
+          <w:instrText xml:space="preserve"> PAGEREF _Toc240127467 \h </w:instrText>
         </w:r>
         <w:r>
           <w:rPr>
@@ -239,7 +251,7 @@
           <w14:ligatures w14:val="standardContextual"/>
         </w:rPr>
       </w:pPr>
-      <w:hyperlink w:anchor="_Toc240103570" w:history="1">
+      <w:hyperlink w:anchor="_Toc240127468" w:history="1">
         <w:r>
           <w:rPr>
             <w:rStyle w:val="Hyperlink"/>
@@ -266,7 +278,7 @@
             <w:noProof/>
             <w:webHidden/>
           </w:rPr>
-          <w:instrText xml:space="preserve"> PAGEREF _Toc240103570 \h </w:instrText>
+          <w:instrText xml:space="preserve"> PAGEREF _Toc240127468 \h </w:instrText>
         </w:r>
         <w:r>
           <w:rPr>
@@ -312,7 +324,7 @@
           <w14:ligatures w14:val="standardContextual"/>
         </w:rPr>
       </w:pPr>
-      <w:hyperlink w:anchor="_Toc240103571" w:history="1">
+      <w:hyperlink w:anchor="_Toc240127469" w:history="1">
         <w:r>
           <w:rPr>
             <w:rStyle w:val="Hyperlink"/>
@@ -339,7 +351,7 @@
             <w:noProof/>
             <w:webHidden/>
           </w:rPr>
-          <w:instrText xml:space="preserve"> PAGEREF _Toc240103571 \h </w:instrText>
+          <w:instrText xml:space="preserve"> PAGEREF _Toc240127469 \h </w:instrText>
         </w:r>
         <w:r>
           <w:rPr>
@@ -385,7 +397,7 @@
           <w14:ligatures w14:val="standardContextual"/>
         </w:rPr>
       </w:pPr>
-      <w:hyperlink w:anchor="_Toc240103572" w:history="1">
+      <w:hyperlink w:anchor="_Toc240127470" w:history="1">
         <w:r>
           <w:rPr>
             <w:rStyle w:val="Hyperlink"/>
@@ -412,7 +424,7 @@
             <w:noProof/>
             <w:webHidden/>
           </w:rPr>
-          <w:instrText xml:space="preserve"> PAGEREF _Toc240103572 \h </w:instrText>
+          <w:instrText xml:space="preserve"> PAGEREF _Toc240127470 \h </w:instrText>
         </w:r>
         <w:r>
           <w:rPr>
@@ -458,7 +470,7 @@
           <w14:ligatures w14:val="standardContextual"/>
         </w:rPr>
       </w:pPr>
-      <w:hyperlink w:anchor="_Toc240103573" w:history="1">
+      <w:hyperlink w:anchor="_Toc240127471" w:history="1">
         <w:r>
           <w:rPr>
             <w:rStyle w:val="Hyperlink"/>
@@ -485,7 +497,7 @@
             <w:noProof/>
             <w:webHidden/>
           </w:rPr>
-          <w:instrText xml:space="preserve"> PAGEREF _Toc240103573 \h </w:instrText>
+          <w:instrText xml:space="preserve"> PAGEREF _Toc240127471 \h </w:instrText>
         </w:r>
         <w:r>
           <w:rPr>
@@ -531,7 +543,7 @@
           <w14:ligatures w14:val="standardContextual"/>
         </w:rPr>
       </w:pPr>
-      <w:hyperlink w:anchor="_Toc240103574" w:history="1">
+      <w:hyperlink w:anchor="_Toc240127472" w:history="1">
         <w:r>
           <w:rPr>
             <w:rStyle w:val="Hyperlink"/>
@@ -558,7 +570,7 @@
             <w:noProof/>
             <w:webHidden/>
           </w:rPr>
-          <w:instrText xml:space="preserve"> PAGEREF _Toc240103574 \h </w:instrText>
+          <w:instrText xml:space="preserve"> PAGEREF _Toc240127472 \h </w:instrText>
         </w:r>
         <w:r>
           <w:rPr>
@@ -604,7 +616,7 @@
           <w14:ligatures w14:val="standardContextual"/>
         </w:rPr>
       </w:pPr>
-      <w:hyperlink w:anchor="_Toc240103575" w:history="1">
+      <w:hyperlink w:anchor="_Toc240127473" w:history="1">
         <w:r>
           <w:rPr>
             <w:rStyle w:val="Hyperlink"/>
@@ -631,7 +643,7 @@
             <w:noProof/>
             <w:webHidden/>
           </w:rPr>
-          <w:instrText xml:space="preserve"> PAGEREF _Toc240103575 \h </w:instrText>
+          <w:instrText xml:space="preserve"> PAGEREF _Toc240127473 \h </w:instrText>
         </w:r>
         <w:r>
           <w:rPr>
@@ -677,7 +689,7 @@
           <w14:ligatures w14:val="standardContextual"/>
         </w:rPr>
       </w:pPr>
-      <w:hyperlink w:anchor="_Toc240103576" w:history="1">
+      <w:hyperlink w:anchor="_Toc240127474" w:history="1">
         <w:r>
           <w:rPr>
             <w:rStyle w:val="Hyperlink"/>
@@ -704,7 +716,7 @@
             <w:noProof/>
             <w:webHidden/>
           </w:rPr>
-          <w:instrText xml:space="preserve"> PAGEREF _Toc240103576 \h </w:instrText>
+          <w:instrText xml:space="preserve"> PAGEREF _Toc240127474 \h </w:instrText>
         </w:r>
         <w:r>
           <w:rPr>
@@ -750,7 +762,7 @@
           <w14:ligatures w14:val="standardContextual"/>
         </w:rPr>
       </w:pPr>
-      <w:hyperlink w:anchor="_Toc240103577" w:history="1">
+      <w:hyperlink w:anchor="_Toc240127475" w:history="1">
         <w:r>
           <w:rPr>
             <w:rStyle w:val="Hyperlink"/>
@@ -777,7 +789,7 @@
             <w:noProof/>
             <w:webHidden/>
           </w:rPr>
-          <w:instrText xml:space="preserve"> PAGEREF _Toc240103577 \h </w:instrText>
+          <w:instrText xml:space="preserve"> PAGEREF _Toc240127475 \h </w:instrText>
         </w:r>
         <w:r>
           <w:rPr>
@@ -823,7 +835,7 @@
           <w14:ligatures w14:val="standardContextual"/>
         </w:rPr>
       </w:pPr>
-      <w:hyperlink w:anchor="_Toc240103578" w:history="1">
+      <w:hyperlink w:anchor="_Toc240127476" w:history="1">
         <w:r>
           <w:rPr>
             <w:rStyle w:val="Hyperlink"/>
@@ -850,7 +862,7 @@
             <w:noProof/>
             <w:webHidden/>
           </w:rPr>
-          <w:instrText xml:space="preserve"> PAGEREF _Toc240103578 \h </w:instrText>
+          <w:instrText xml:space="preserve"> PAGEREF _Toc240127476 \h </w:instrText>
         </w:r>
         <w:r>
           <w:rPr>
@@ -896,7 +908,7 @@
           <w14:ligatures w14:val="standardContextual"/>
         </w:rPr>
       </w:pPr>
-      <w:hyperlink w:anchor="_Toc240103579" w:history="1">
+      <w:hyperlink w:anchor="_Toc240127477" w:history="1">
         <w:r>
           <w:rPr>
             <w:rStyle w:val="Hyperlink"/>
@@ -923,7 +935,7 @@
             <w:noProof/>
             <w:webHidden/>
           </w:rPr>
-          <w:instrText xml:space="preserve"> PAGEREF _Toc240103579 \h </w:instrText>
+          <w:instrText xml:space="preserve"> PAGEREF _Toc240127477 \h </w:instrText>
         </w:r>
         <w:r>
           <w:rPr>
@@ -969,7 +981,7 @@
           <w14:ligatures w14:val="standardContextual"/>
         </w:rPr>
       </w:pPr>
-      <w:hyperlink w:anchor="_Toc240103580" w:history="1">
+      <w:hyperlink w:anchor="_Toc240127478" w:history="1">
         <w:r>
           <w:rPr>
             <w:rStyle w:val="Hyperlink"/>
@@ -996,7 +1008,7 @@
             <w:noProof/>
             <w:webHidden/>
           </w:rPr>
-          <w:instrText xml:space="preserve"> PAGEREF _Toc240103580 \h </w:instrText>
+          <w:instrText xml:space="preserve"> PAGEREF _Toc240127478 \h </w:instrText>
         </w:r>
         <w:r>
           <w:rPr>
@@ -1042,7 +1054,7 @@
           <w14:ligatures w14:val="standardContextual"/>
         </w:rPr>
       </w:pPr>
-      <w:hyperlink w:anchor="_Toc240103581" w:history="1">
+      <w:hyperlink w:anchor="_Toc240127479" w:history="1">
         <w:r>
           <w:rPr>
             <w:rStyle w:val="Hyperlink"/>
@@ -1069,7 +1081,7 @@
             <w:noProof/>
             <w:webHidden/>
           </w:rPr>
-          <w:instrText xml:space="preserve"> PAGEREF _Toc240103581 \h </w:instrText>
+          <w:instrText xml:space="preserve"> PAGEREF _Toc240127479 \h </w:instrText>
         </w:r>
         <w:r>
           <w:rPr>
@@ -1115,7 +1127,7 @@
           <w14:ligatures w14:val="standardContextual"/>
         </w:rPr>
       </w:pPr>
-      <w:hyperlink w:anchor="_Toc240103582" w:history="1">
+      <w:hyperlink w:anchor="_Toc240127480" w:history="1">
         <w:r>
           <w:rPr>
             <w:rStyle w:val="Hyperlink"/>
@@ -1142,7 +1154,7 @@
             <w:noProof/>
             <w:webHidden/>
           </w:rPr>
-          <w:instrText xml:space="preserve"> PAGEREF _Toc240103582 \h </w:instrText>
+          <w:instrText xml:space="preserve"> PAGEREF _Toc240127480 \h </w:instrText>
         </w:r>
         <w:r>
           <w:rPr>
@@ -1188,7 +1200,7 @@
           <w14:ligatures w14:val="standardContextual"/>
         </w:rPr>
       </w:pPr>
-      <w:hyperlink w:anchor="_Toc240103583" w:history="1">
+      <w:hyperlink w:anchor="_Toc240127481" w:history="1">
         <w:r>
           <w:rPr>
             <w:rStyle w:val="Hyperlink"/>
@@ -1215,7 +1227,7 @@
             <w:noProof/>
             <w:webHidden/>
           </w:rPr>
-          <w:instrText xml:space="preserve"> PAGEREF _Toc240103583 \h </w:instrText>
+          <w:instrText xml:space="preserve"> PAGEREF _Toc240127481 \h </w:instrText>
         </w:r>
         <w:r>
           <w:rPr>
@@ -1261,7 +1273,7 @@
           <w14:ligatures w14:val="standardContextual"/>
         </w:rPr>
       </w:pPr>
-      <w:hyperlink w:anchor="_Toc240103584" w:history="1">
+      <w:hyperlink w:anchor="_Toc240127482" w:history="1">
         <w:r>
           <w:rPr>
             <w:rStyle w:val="Hyperlink"/>
@@ -1288,7 +1300,7 @@
             <w:noProof/>
             <w:webHidden/>
           </w:rPr>
-          <w:instrText xml:space="preserve"> PAGEREF _Toc240103584 \h </w:instrText>
+          <w:instrText xml:space="preserve"> PAGEREF _Toc240127482 \h </w:instrText>
         </w:r>
         <w:r>
           <w:rPr>
@@ -1334,7 +1346,7 @@
           <w14:ligatures w14:val="standardContextual"/>
         </w:rPr>
       </w:pPr>
-      <w:hyperlink w:anchor="_Toc240103585" w:history="1">
+      <w:hyperlink w:anchor="_Toc240127483" w:history="1">
         <w:r>
           <w:rPr>
             <w:rStyle w:val="Hyperlink"/>
@@ -1361,7 +1373,7 @@
             <w:noProof/>
             <w:webHidden/>
           </w:rPr>
-          <w:instrText xml:space="preserve"> PAGEREF _Toc240103585 \h </w:instrText>
+          <w:instrText xml:space="preserve"> PAGEREF _Toc240127483 \h </w:instrText>
         </w:r>
         <w:r>
           <w:rPr>
@@ -1407,13 +1419,13 @@
           <w14:ligatures w14:val="standardContextual"/>
         </w:rPr>
       </w:pPr>
-      <w:hyperlink w:anchor="_Toc240103586" w:history="1">
+      <w:hyperlink w:anchor="_Toc240127484" w:history="1">
         <w:r>
           <w:rPr>
             <w:rStyle w:val="Hyperlink"/>
             <w:noProof/>
           </w:rPr>
-          <w:t>3.6 AN06 — Consultar ajuda editorial</w:t>
+          <w:t>3.6 AN06 — Consultar ajuda do exercício</w:t>
         </w:r>
         <w:r>
           <w:rPr>
@@ -1434,7 +1446,7 @@
             <w:noProof/>
             <w:webHidden/>
           </w:rPr>
-          <w:instrText xml:space="preserve"> PAGEREF _Toc240103586 \h </w:instrText>
+          <w:instrText xml:space="preserve"> PAGEREF _Toc240127484 \h </w:instrText>
         </w:r>
         <w:r>
           <w:rPr>
@@ -1480,7 +1492,7 @@
           <w14:ligatures w14:val="standardContextual"/>
         </w:rPr>
       </w:pPr>
-      <w:hyperlink w:anchor="_Toc240103587" w:history="1">
+      <w:hyperlink w:anchor="_Toc240127485" w:history="1">
         <w:r>
           <w:rPr>
             <w:rStyle w:val="Hyperlink"/>
@@ -1507,7 +1519,7 @@
             <w:noProof/>
             <w:webHidden/>
           </w:rPr>
-          <w:instrText xml:space="preserve"> PAGEREF _Toc240103587 \h </w:instrText>
+          <w:instrText xml:space="preserve"> PAGEREF _Toc240127485 \h </w:instrText>
         </w:r>
         <w:r>
           <w:rPr>
@@ -1553,7 +1565,7 @@
           <w14:ligatures w14:val="standardContextual"/>
         </w:rPr>
       </w:pPr>
-      <w:hyperlink w:anchor="_Toc240103588" w:history="1">
+      <w:hyperlink w:anchor="_Toc240127486" w:history="1">
         <w:r>
           <w:rPr>
             <w:rStyle w:val="Hyperlink"/>
@@ -1580,7 +1592,7 @@
             <w:noProof/>
             <w:webHidden/>
           </w:rPr>
-          <w:instrText xml:space="preserve"> PAGEREF _Toc240103588 \h </w:instrText>
+          <w:instrText xml:space="preserve"> PAGEREF _Toc240127486 \h </w:instrText>
         </w:r>
         <w:r>
           <w:rPr>
@@ -1626,7 +1638,7 @@
           <w14:ligatures w14:val="standardContextual"/>
         </w:rPr>
       </w:pPr>
-      <w:hyperlink w:anchor="_Toc240103589" w:history="1">
+      <w:hyperlink w:anchor="_Toc240127487" w:history="1">
         <w:r>
           <w:rPr>
             <w:rStyle w:val="Hyperlink"/>
@@ -1653,7 +1665,7 @@
             <w:noProof/>
             <w:webHidden/>
           </w:rPr>
-          <w:instrText xml:space="preserve"> PAGEREF _Toc240103589 \h </w:instrText>
+          <w:instrText xml:space="preserve"> PAGEREF _Toc240127487 \h </w:instrText>
         </w:r>
         <w:r>
           <w:rPr>
@@ -1699,7 +1711,7 @@
           <w14:ligatures w14:val="standardContextual"/>
         </w:rPr>
       </w:pPr>
-      <w:hyperlink w:anchor="_Toc240103590" w:history="1">
+      <w:hyperlink w:anchor="_Toc240127488" w:history="1">
         <w:r>
           <w:rPr>
             <w:rStyle w:val="Hyperlink"/>
@@ -1726,7 +1738,7 @@
             <w:noProof/>
             <w:webHidden/>
           </w:rPr>
-          <w:instrText xml:space="preserve"> PAGEREF _Toc240103590 \h </w:instrText>
+          <w:instrText xml:space="preserve"> PAGEREF _Toc240127488 \h </w:instrText>
         </w:r>
         <w:r>
           <w:rPr>
@@ -1772,7 +1784,7 @@
           <w14:ligatures w14:val="standardContextual"/>
         </w:rPr>
       </w:pPr>
-      <w:hyperlink w:anchor="_Toc240103591" w:history="1">
+      <w:hyperlink w:anchor="_Toc240127489" w:history="1">
         <w:r>
           <w:rPr>
             <w:rStyle w:val="Hyperlink"/>
@@ -1799,7 +1811,7 @@
             <w:noProof/>
             <w:webHidden/>
           </w:rPr>
-          <w:instrText xml:space="preserve"> PAGEREF _Toc240103591 \h </w:instrText>
+          <w:instrText xml:space="preserve"> PAGEREF _Toc240127489 \h </w:instrText>
         </w:r>
         <w:r>
           <w:rPr>
@@ -1845,7 +1857,7 @@
           <w14:ligatures w14:val="standardContextual"/>
         </w:rPr>
       </w:pPr>
-      <w:hyperlink w:anchor="_Toc240103592" w:history="1">
+      <w:hyperlink w:anchor="_Toc240127490" w:history="1">
         <w:r>
           <w:rPr>
             <w:rStyle w:val="Hyperlink"/>
@@ -1872,7 +1884,7 @@
             <w:noProof/>
             <w:webHidden/>
           </w:rPr>
-          <w:instrText xml:space="preserve"> PAGEREF _Toc240103592 \h </w:instrText>
+          <w:instrText xml:space="preserve"> PAGEREF _Toc240127490 \h </w:instrText>
         </w:r>
         <w:r>
           <w:rPr>
@@ -1918,7 +1930,7 @@
           <w14:ligatures w14:val="standardContextual"/>
         </w:rPr>
       </w:pPr>
-      <w:hyperlink w:anchor="_Toc240103593" w:history="1">
+      <w:hyperlink w:anchor="_Toc240127491" w:history="1">
         <w:r>
           <w:rPr>
             <w:rStyle w:val="Hyperlink"/>
@@ -1945,7 +1957,7 @@
             <w:noProof/>
             <w:webHidden/>
           </w:rPr>
-          <w:instrText xml:space="preserve"> PAGEREF _Toc240103593 \h </w:instrText>
+          <w:instrText xml:space="preserve"> PAGEREF _Toc240127491 \h </w:instrText>
         </w:r>
         <w:r>
           <w:rPr>
@@ -1991,7 +2003,7 @@
           <w14:ligatures w14:val="standardContextual"/>
         </w:rPr>
       </w:pPr>
-      <w:hyperlink w:anchor="_Toc240103594" w:history="1">
+      <w:hyperlink w:anchor="_Toc240127492" w:history="1">
         <w:r>
           <w:rPr>
             <w:rStyle w:val="Hyperlink"/>
@@ -2018,7 +2030,7 @@
             <w:noProof/>
             <w:webHidden/>
           </w:rPr>
-          <w:instrText xml:space="preserve"> PAGEREF _Toc240103594 \h </w:instrText>
+          <w:instrText xml:space="preserve"> PAGEREF _Toc240127492 \h </w:instrText>
         </w:r>
         <w:r>
           <w:rPr>
@@ -2064,7 +2076,7 @@
           <w14:ligatures w14:val="standardContextual"/>
         </w:rPr>
       </w:pPr>
-      <w:hyperlink w:anchor="_Toc240103595" w:history="1">
+      <w:hyperlink w:anchor="_Toc240127493" w:history="1">
         <w:r>
           <w:rPr>
             <w:rStyle w:val="Hyperlink"/>
@@ -2091,7 +2103,7 @@
             <w:noProof/>
             <w:webHidden/>
           </w:rPr>
-          <w:instrText xml:space="preserve"> PAGEREF _Toc240103595 \h </w:instrText>
+          <w:instrText xml:space="preserve"> PAGEREF _Toc240127493 \h </w:instrText>
         </w:r>
         <w:r>
           <w:rPr>
@@ -2137,7 +2149,7 @@
           <w14:ligatures w14:val="standardContextual"/>
         </w:rPr>
       </w:pPr>
-      <w:hyperlink w:anchor="_Toc240103596" w:history="1">
+      <w:hyperlink w:anchor="_Toc240127494" w:history="1">
         <w:r>
           <w:rPr>
             <w:rStyle w:val="Hyperlink"/>
@@ -2164,7 +2176,7 @@
             <w:noProof/>
             <w:webHidden/>
           </w:rPr>
-          <w:instrText xml:space="preserve"> PAGEREF _Toc240103596 \h </w:instrText>
+          <w:instrText xml:space="preserve"> PAGEREF _Toc240127494 \h </w:instrText>
         </w:r>
         <w:r>
           <w:rPr>
@@ -2210,7 +2222,7 @@
           <w14:ligatures w14:val="standardContextual"/>
         </w:rPr>
       </w:pPr>
-      <w:hyperlink w:anchor="_Toc240103597" w:history="1">
+      <w:hyperlink w:anchor="_Toc240127495" w:history="1">
         <w:r>
           <w:rPr>
             <w:rStyle w:val="Hyperlink"/>
@@ -2237,7 +2249,7 @@
             <w:noProof/>
             <w:webHidden/>
           </w:rPr>
-          <w:instrText xml:space="preserve"> PAGEREF _Toc240103597 \h </w:instrText>
+          <w:instrText xml:space="preserve"> PAGEREF _Toc240127495 \h </w:instrText>
         </w:r>
         <w:r>
           <w:rPr>
@@ -2283,7 +2295,7 @@
           <w14:ligatures w14:val="standardContextual"/>
         </w:rPr>
       </w:pPr>
-      <w:hyperlink w:anchor="_Toc240103598" w:history="1">
+      <w:hyperlink w:anchor="_Toc240127496" w:history="1">
         <w:r>
           <w:rPr>
             <w:rStyle w:val="Hyperlink"/>
@@ -2310,7 +2322,7 @@
             <w:noProof/>
             <w:webHidden/>
           </w:rPr>
-          <w:instrText xml:space="preserve"> PAGEREF _Toc240103598 \h </w:instrText>
+          <w:instrText xml:space="preserve"> PAGEREF _Toc240127496 \h </w:instrText>
         </w:r>
         <w:r>
           <w:rPr>
@@ -2355,8 +2367,11 @@
       <w:pPr>
         <w:pStyle w:val="Ttulo1"/>
       </w:pPr>
-      <w:bookmarkStart w:id="1" w:name="_Toc240103569"/>
-      <w:r>
+      <w:bookmarkStart w:id="1" w:name="_Toc240127467"/>
+      <w:r>
+        <w:rPr>
+          <w:color w:val="1F4E78"/>
+        </w:rPr>
         <w:t>2. Objetivo</w:t>
       </w:r>
       <w:bookmarkEnd w:id="1"/>
@@ -2370,8 +2385,11 @@
       <w:pPr>
         <w:pStyle w:val="Ttulo1"/>
       </w:pPr>
-      <w:bookmarkStart w:id="2" w:name="_Toc240103570"/>
-      <w:r>
+      <w:bookmarkStart w:id="2" w:name="_Toc240127468"/>
+      <w:r>
+        <w:rPr>
+          <w:color w:val="1F4E78"/>
+        </w:rPr>
         <w:t>3. Atividades do Negócio</w:t>
       </w:r>
       <w:bookmarkEnd w:id="2"/>
@@ -2385,8 +2403,11 @@
       <w:pPr>
         <w:pStyle w:val="Ttulo2"/>
       </w:pPr>
-      <w:bookmarkStart w:id="3" w:name="_Toc240103571"/>
-      <w:r>
+      <w:bookmarkStart w:id="3" w:name="_Toc240127469"/>
+      <w:r>
+        <w:rPr>
+          <w:color w:val="1F4E78"/>
+        </w:rPr>
         <w:t>3.1 AN01 — Aprender em uma trilha</w:t>
       </w:r>
       <w:bookmarkEnd w:id="3"/>
@@ -2437,7 +2458,7 @@
       <w:pPr>
         <w:pStyle w:val="Ttulo3"/>
       </w:pPr>
-      <w:bookmarkStart w:id="4" w:name="_Toc240103572"/>
+      <w:bookmarkStart w:id="4" w:name="_Toc240127470"/>
       <w:r>
         <w:t>3.1.1 Fluxo principal</w:t>
       </w:r>
@@ -2601,7 +2622,7 @@
       <w:pPr>
         <w:pStyle w:val="Ttulo3"/>
       </w:pPr>
-      <w:bookmarkStart w:id="5" w:name="_Toc240103573"/>
+      <w:bookmarkStart w:id="5" w:name="_Toc240127471"/>
       <w:r>
         <w:lastRenderedPageBreak/>
         <w:t>3.1.2 Diagrama de Atividades</w:t>
@@ -2661,7 +2682,6 @@
       <w:r>
         <w:rPr>
           <w:i/>
-          <w:sz w:val="17"/>
         </w:rPr>
         <w:t>Figura 1 — AN01 Aprender em uma trilha.</w:t>
       </w:r>
@@ -2680,8 +2700,11 @@
       <w:pPr>
         <w:pStyle w:val="Ttulo2"/>
       </w:pPr>
-      <w:bookmarkStart w:id="6" w:name="_Toc240103574"/>
-      <w:r>
+      <w:bookmarkStart w:id="6" w:name="_Toc240127472"/>
+      <w:r>
+        <w:rPr>
+          <w:color w:val="1F4E78"/>
+        </w:rPr>
         <w:t>3.2 AN02 — Participar de duelo</w:t>
       </w:r>
       <w:bookmarkEnd w:id="6"/>
@@ -2732,7 +2755,7 @@
       <w:pPr>
         <w:pStyle w:val="Ttulo3"/>
       </w:pPr>
-      <w:bookmarkStart w:id="7" w:name="_Toc240103575"/>
+      <w:bookmarkStart w:id="7" w:name="_Toc240127473"/>
       <w:r>
         <w:t>3.2.1 Fluxo principal</w:t>
       </w:r>
@@ -2911,9 +2934,22 @@
           <w:tcPr>
             <w:tcW w:w="9720" w:type="dxa"/>
             <w:shd w:val="clear" w:color="auto" w:fill="FEF3C7"/>
+            <w:tcMar>
+              <w:top w:w="80" w:type="dxa"/>
+              <w:left w:w="140" w:type="dxa"/>
+              <w:bottom w:w="80" w:type="dxa"/>
+              <w:right w:w="140" w:type="dxa"/>
+            </w:tcMar>
           </w:tcPr>
           <w:p>
+            <w:pPr>
+              <w:spacing w:after="0"/>
+            </w:pPr>
             <w:r>
+              <w:rPr>
+                <w:i/>
+                <w:sz w:val="19"/>
+              </w:rPr>
               <w:t>Critério adotado: o sistema aplica as permissões, prazos e efeitos descritos nas regras de negócio e registra falhas como fluxos alternativos.</w:t>
             </w:r>
           </w:p>
@@ -2929,7 +2965,7 @@
       <w:pPr>
         <w:pStyle w:val="Ttulo3"/>
       </w:pPr>
-      <w:bookmarkStart w:id="8" w:name="_Toc240103576"/>
+      <w:bookmarkStart w:id="8" w:name="_Toc240127474"/>
       <w:r>
         <w:lastRenderedPageBreak/>
         <w:t>3.2.2 Diagrama de Atividades</w:t>
@@ -2989,7 +3025,6 @@
       <w:r>
         <w:rPr>
           <w:i/>
-          <w:sz w:val="17"/>
         </w:rPr>
         <w:t>Figura 2 — AN02 Participar de duelo.</w:t>
       </w:r>
@@ -3008,8 +3043,11 @@
       <w:pPr>
         <w:pStyle w:val="Ttulo2"/>
       </w:pPr>
-      <w:bookmarkStart w:id="9" w:name="_Toc240103577"/>
-      <w:r>
+      <w:bookmarkStart w:id="9" w:name="_Toc240127475"/>
+      <w:r>
+        <w:rPr>
+          <w:color w:val="1F4E78"/>
+        </w:rPr>
         <w:t>3.3 AN03 — Resolver exercício</w:t>
       </w:r>
       <w:bookmarkEnd w:id="9"/>
@@ -3060,7 +3098,7 @@
       <w:pPr>
         <w:pStyle w:val="Ttulo3"/>
       </w:pPr>
-      <w:bookmarkStart w:id="10" w:name="_Toc240103578"/>
+      <w:bookmarkStart w:id="10" w:name="_Toc240127476"/>
       <w:r>
         <w:t>3.3.1 Fluxo principal</w:t>
       </w:r>
@@ -3210,7 +3248,7 @@
       <w:pPr>
         <w:pStyle w:val="Ttulo3"/>
       </w:pPr>
-      <w:bookmarkStart w:id="11" w:name="_Toc240103579"/>
+      <w:bookmarkStart w:id="11" w:name="_Toc240127477"/>
       <w:r>
         <w:lastRenderedPageBreak/>
         <w:t>3.3.2 Diagrama de Atividades</w:t>
@@ -3270,7 +3308,6 @@
       <w:r>
         <w:rPr>
           <w:i/>
-          <w:sz w:val="17"/>
         </w:rPr>
         <w:t>Figura 3 — AN03 Resolver exercício.</w:t>
       </w:r>
@@ -3289,8 +3326,11 @@
       <w:pPr>
         <w:pStyle w:val="Ttulo2"/>
       </w:pPr>
-      <w:bookmarkStart w:id="12" w:name="_Toc240103580"/>
-      <w:r>
+      <w:bookmarkStart w:id="12" w:name="_Toc240127478"/>
+      <w:r>
+        <w:rPr>
+          <w:color w:val="1F4E78"/>
+        </w:rPr>
         <w:t>3.4 AN04 — Registrar XP e consultar evolução</w:t>
       </w:r>
       <w:bookmarkEnd w:id="12"/>
@@ -3341,7 +3381,7 @@
       <w:pPr>
         <w:pStyle w:val="Ttulo3"/>
       </w:pPr>
-      <w:bookmarkStart w:id="13" w:name="_Toc240103581"/>
+      <w:bookmarkStart w:id="13" w:name="_Toc240127479"/>
       <w:r>
         <w:t>3.4.1 Fluxo principal</w:t>
       </w:r>
@@ -3505,7 +3545,7 @@
       <w:pPr>
         <w:pStyle w:val="Ttulo3"/>
       </w:pPr>
-      <w:bookmarkStart w:id="14" w:name="_Toc240103582"/>
+      <w:bookmarkStart w:id="14" w:name="_Toc240127480"/>
       <w:r>
         <w:lastRenderedPageBreak/>
         <w:t>3.4.2 Diagrama de Atividades</w:t>
@@ -3565,7 +3605,6 @@
       <w:r>
         <w:rPr>
           <w:i/>
-          <w:sz w:val="17"/>
         </w:rPr>
         <w:t>Figura 4 — AN04 Registrar XP e consultar evolução.</w:t>
       </w:r>
@@ -3584,8 +3623,11 @@
       <w:pPr>
         <w:pStyle w:val="Ttulo2"/>
       </w:pPr>
-      <w:bookmarkStart w:id="15" w:name="_Toc240103583"/>
-      <w:r>
+      <w:bookmarkStart w:id="15" w:name="_Toc240127481"/>
+      <w:r>
+        <w:rPr>
+          <w:color w:val="1F4E78"/>
+        </w:rPr>
         <w:t>3.5 AN05 — Interagir com a comunidade</w:t>
       </w:r>
       <w:bookmarkEnd w:id="15"/>
@@ -3636,7 +3678,7 @@
       <w:pPr>
         <w:pStyle w:val="Ttulo3"/>
       </w:pPr>
-      <w:bookmarkStart w:id="16" w:name="_Toc240103584"/>
+      <w:bookmarkStart w:id="16" w:name="_Toc240127482"/>
       <w:r>
         <w:t>3.5.1 Fluxo principal</w:t>
       </w:r>
@@ -3800,7 +3842,7 @@
       <w:pPr>
         <w:pStyle w:val="Ttulo3"/>
       </w:pPr>
-      <w:bookmarkStart w:id="17" w:name="_Toc240103585"/>
+      <w:bookmarkStart w:id="17" w:name="_Toc240127483"/>
       <w:r>
         <w:lastRenderedPageBreak/>
         <w:t>3.5.2 Diagrama de Atividades</w:t>
@@ -3860,7 +3902,6 @@
       <w:r>
         <w:rPr>
           <w:i/>
-          <w:sz w:val="17"/>
         </w:rPr>
         <w:t>Figura 5 — AN05 Interagir com a comunidade.</w:t>
       </w:r>
@@ -3879,9 +3920,12 @@
       <w:pPr>
         <w:pStyle w:val="Ttulo2"/>
       </w:pPr>
-      <w:bookmarkStart w:id="18" w:name="_Toc240103586"/>
-      <w:r>
-        <w:t>3.6 AN06 — Consultar ajuda editorial</w:t>
+      <w:bookmarkStart w:id="18" w:name="_Toc240127484"/>
+      <w:r>
+        <w:rPr>
+          <w:color w:val="1F4E78"/>
+        </w:rPr>
+        <w:t>3.6 AN06 — Consultar ajuda do exercício</w:t>
       </w:r>
       <w:bookmarkEnd w:id="18"/>
     </w:p>
@@ -3931,7 +3975,7 @@
       <w:pPr>
         <w:pStyle w:val="Ttulo3"/>
       </w:pPr>
-      <w:bookmarkStart w:id="19" w:name="_Toc240103587"/>
+      <w:bookmarkStart w:id="19" w:name="_Toc240127485"/>
       <w:r>
         <w:t>3.6.1 Fluxo principal</w:t>
       </w:r>
@@ -4067,7 +4111,7 @@
       <w:pPr>
         <w:pStyle w:val="Ttulo3"/>
       </w:pPr>
-      <w:bookmarkStart w:id="20" w:name="_Toc240103588"/>
+      <w:bookmarkStart w:id="20" w:name="_Toc240127486"/>
       <w:r>
         <w:lastRenderedPageBreak/>
         <w:t>3.6.2 Diagrama de Atividades</w:t>
@@ -4125,11 +4169,7 @@
         <w:jc w:val="center"/>
       </w:pPr>
       <w:r>
-        <w:rPr>
-          <w:i/>
-          <w:sz w:val="17"/>
-        </w:rPr>
-        <w:t>Figura 6 — AN06 Consultar ajuda editorial.</w:t>
+        <w:t>Figura 6 — AN06 Consultar ajuda do exercício.</w:t>
       </w:r>
     </w:p>
     <w:p>
@@ -4146,8 +4186,11 @@
       <w:pPr>
         <w:pStyle w:val="Ttulo2"/>
       </w:pPr>
-      <w:bookmarkStart w:id="21" w:name="_Toc240103589"/>
-      <w:r>
+      <w:bookmarkStart w:id="21" w:name="_Toc240127487"/>
+      <w:r>
+        <w:rPr>
+          <w:color w:val="1F4E78"/>
+        </w:rPr>
         <w:t>3.7 AN07 — Atuar como avaliador</w:t>
       </w:r>
       <w:bookmarkEnd w:id="21"/>
@@ -4198,7 +4241,7 @@
       <w:pPr>
         <w:pStyle w:val="Ttulo3"/>
       </w:pPr>
-      <w:bookmarkStart w:id="22" w:name="_Toc240103590"/>
+      <w:bookmarkStart w:id="22" w:name="_Toc240127488"/>
       <w:r>
         <w:t>3.7.1 Fluxo principal</w:t>
       </w:r>
@@ -4377,9 +4420,22 @@
           <w:tcPr>
             <w:tcW w:w="9720" w:type="dxa"/>
             <w:shd w:val="clear" w:color="auto" w:fill="FEF3C7"/>
+            <w:tcMar>
+              <w:top w:w="80" w:type="dxa"/>
+              <w:left w:w="140" w:type="dxa"/>
+              <w:bottom w:w="80" w:type="dxa"/>
+              <w:right w:w="140" w:type="dxa"/>
+            </w:tcMar>
           </w:tcPr>
           <w:p>
+            <w:pPr>
+              <w:spacing w:after="0"/>
+            </w:pPr>
             <w:r>
+              <w:rPr>
+                <w:i/>
+                <w:sz w:val="19"/>
+              </w:rPr>
               <w:t>Critério adotado: o sistema aplica as permissões, prazos e efeitos descritos nas regras de negócio e registra falhas como fluxos alternativos.</w:t>
             </w:r>
           </w:p>
@@ -4395,7 +4451,7 @@
       <w:pPr>
         <w:pStyle w:val="Ttulo3"/>
       </w:pPr>
-      <w:bookmarkStart w:id="23" w:name="_Toc240103591"/>
+      <w:bookmarkStart w:id="23" w:name="_Toc240127489"/>
       <w:r>
         <w:lastRenderedPageBreak/>
         <w:t>3.7.2 Diagrama de Atividades</w:t>
@@ -4455,7 +4511,6 @@
       <w:r>
         <w:rPr>
           <w:i/>
-          <w:sz w:val="17"/>
         </w:rPr>
         <w:t>Figura 7 — AN07 Atuar como avaliador.</w:t>
       </w:r>
@@ -4474,8 +4529,11 @@
       <w:pPr>
         <w:pStyle w:val="Ttulo2"/>
       </w:pPr>
-      <w:bookmarkStart w:id="24" w:name="_Toc240103592"/>
-      <w:r>
+      <w:bookmarkStart w:id="24" w:name="_Toc240127490"/>
+      <w:r>
+        <w:rPr>
+          <w:color w:val="1F4E78"/>
+        </w:rPr>
         <w:t>3.8 AN08 — Empresa divulgar vaga</w:t>
       </w:r>
       <w:bookmarkEnd w:id="24"/>
@@ -4526,7 +4584,7 @@
       <w:pPr>
         <w:pStyle w:val="Ttulo3"/>
       </w:pPr>
-      <w:bookmarkStart w:id="25" w:name="_Toc240103593"/>
+      <w:bookmarkStart w:id="25" w:name="_Toc240127491"/>
       <w:r>
         <w:t>3.8.1 Fluxo principal</w:t>
       </w:r>
@@ -4705,9 +4763,22 @@
           <w:tcPr>
             <w:tcW w:w="9720" w:type="dxa"/>
             <w:shd w:val="clear" w:color="auto" w:fill="FEF3C7"/>
+            <w:tcMar>
+              <w:top w:w="80" w:type="dxa"/>
+              <w:left w:w="140" w:type="dxa"/>
+              <w:bottom w:w="80" w:type="dxa"/>
+              <w:right w:w="140" w:type="dxa"/>
+            </w:tcMar>
           </w:tcPr>
           <w:p>
+            <w:pPr>
+              <w:spacing w:after="0"/>
+            </w:pPr>
             <w:r>
+              <w:rPr>
+                <w:i/>
+                <w:sz w:val="19"/>
+              </w:rPr>
               <w:t>Critério adotado: o sistema aplica as permissões, prazos e efeitos descritos nas regras de negócio e registra falhas como fluxos alternativos.</w:t>
             </w:r>
           </w:p>
@@ -4723,7 +4794,7 @@
       <w:pPr>
         <w:pStyle w:val="Ttulo3"/>
       </w:pPr>
-      <w:bookmarkStart w:id="26" w:name="_Toc240103594"/>
+      <w:bookmarkStart w:id="26" w:name="_Toc240127492"/>
       <w:r>
         <w:lastRenderedPageBreak/>
         <w:t>3.8.2 Diagrama de Atividades</w:t>
@@ -4783,7 +4854,6 @@
       <w:r>
         <w:rPr>
           <w:i/>
-          <w:sz w:val="17"/>
         </w:rPr>
         <w:t>Figura 8 — AN08 Empresa divulgar vaga.</w:t>
       </w:r>
@@ -4802,8 +4872,11 @@
       <w:pPr>
         <w:pStyle w:val="Ttulo2"/>
       </w:pPr>
-      <w:bookmarkStart w:id="27" w:name="_Toc240103595"/>
-      <w:r>
+      <w:bookmarkStart w:id="27" w:name="_Toc240127493"/>
+      <w:r>
+        <w:rPr>
+          <w:color w:val="1F4E78"/>
+        </w:rPr>
         <w:t>3.9 AN09 — Administração da plataforma</w:t>
       </w:r>
       <w:bookmarkEnd w:id="27"/>
@@ -4854,7 +4927,7 @@
       <w:pPr>
         <w:pStyle w:val="Ttulo3"/>
       </w:pPr>
-      <w:bookmarkStart w:id="28" w:name="_Toc240103596"/>
+      <w:bookmarkStart w:id="28" w:name="_Toc240127494"/>
       <w:r>
         <w:t>3.9.1 Fluxo principal</w:t>
       </w:r>
@@ -5033,9 +5106,22 @@
           <w:tcPr>
             <w:tcW w:w="9720" w:type="dxa"/>
             <w:shd w:val="clear" w:color="auto" w:fill="FEF3C7"/>
+            <w:tcMar>
+              <w:top w:w="80" w:type="dxa"/>
+              <w:left w:w="140" w:type="dxa"/>
+              <w:bottom w:w="80" w:type="dxa"/>
+              <w:right w:w="140" w:type="dxa"/>
+            </w:tcMar>
           </w:tcPr>
           <w:p>
+            <w:pPr>
+              <w:spacing w:after="0"/>
+            </w:pPr>
             <w:r>
+              <w:rPr>
+                <w:i/>
+                <w:sz w:val="19"/>
+              </w:rPr>
               <w:t>Critério adotado: o sistema aplica as permissões, prazos e efeitos descritos nas regras de negócio e registra falhas como fluxos alternativos.</w:t>
             </w:r>
           </w:p>
@@ -5051,7 +5137,7 @@
       <w:pPr>
         <w:pStyle w:val="Ttulo3"/>
       </w:pPr>
-      <w:bookmarkStart w:id="29" w:name="_Toc240103597"/>
+      <w:bookmarkStart w:id="29" w:name="_Toc240127495"/>
       <w:r>
         <w:lastRenderedPageBreak/>
         <w:t>3.9.2 Diagrama de Atividades</w:t>
@@ -5111,7 +5197,6 @@
       <w:r>
         <w:rPr>
           <w:i/>
-          <w:sz w:val="17"/>
         </w:rPr>
         <w:t>Figura 9 — AN09 Administração da plataforma.</w:t>
       </w:r>
@@ -5125,8 +5210,11 @@
       <w:pPr>
         <w:pStyle w:val="Ttulo1"/>
       </w:pPr>
-      <w:bookmarkStart w:id="30" w:name="_Toc240103598"/>
-      <w:r>
+      <w:bookmarkStart w:id="30" w:name="_Toc240127496"/>
+      <w:r>
+        <w:rPr>
+          <w:color w:val="1F4E78"/>
+        </w:rPr>
         <w:t>4. Relação entre atividades e implementação</w:t>
       </w:r>
       <w:bookmarkEnd w:id="30"/>
@@ -5140,9 +5228,9 @@
         <w:tblLook w:val="04A0" w:firstRow="1" w:lastRow="0" w:firstColumn="1" w:lastColumn="0" w:noHBand="0" w:noVBand="1"/>
       </w:tblPr>
       <w:tblGrid>
-        <w:gridCol w:w="3024"/>
-        <w:gridCol w:w="1800"/>
-        <w:gridCol w:w="4896"/>
+        <w:gridCol w:w="3168"/>
+        <w:gridCol w:w="2592"/>
+        <w:gridCol w:w="3960"/>
       </w:tblGrid>
       <w:tr>
         <w:trPr>
@@ -5151,15 +5239,25 @@
         </w:trPr>
         <w:tc>
           <w:tcPr>
-            <w:tcW w:w="3024" w:type="dxa"/>
+            <w:tcW w:w="3168" w:type="dxa"/>
             <w:shd w:val="clear" w:color="auto" w:fill="1F4E78"/>
+            <w:tcMar>
+              <w:top w:w="60" w:type="dxa"/>
+              <w:left w:w="100" w:type="dxa"/>
+              <w:bottom w:w="60" w:type="dxa"/>
+              <w:right w:w="100" w:type="dxa"/>
+            </w:tcMar>
+            <w:vAlign w:val="center"/>
           </w:tcPr>
           <w:p>
+            <w:pPr>
+              <w:spacing w:after="0"/>
+            </w:pPr>
             <w:r>
               <w:rPr>
                 <w:b/>
                 <w:color w:val="FFFFFF"/>
-                <w:sz w:val="15"/>
+                <w:sz w:val="17"/>
               </w:rPr>
               <w:t>Atividade</w:t>
             </w:r>
@@ -5167,15 +5265,25 @@
         </w:tc>
         <w:tc>
           <w:tcPr>
-            <w:tcW w:w="1800" w:type="dxa"/>
+            <w:tcW w:w="2592" w:type="dxa"/>
             <w:shd w:val="clear" w:color="auto" w:fill="1F4E78"/>
+            <w:tcMar>
+              <w:top w:w="60" w:type="dxa"/>
+              <w:left w:w="100" w:type="dxa"/>
+              <w:bottom w:w="60" w:type="dxa"/>
+              <w:right w:w="100" w:type="dxa"/>
+            </w:tcMar>
+            <w:vAlign w:val="center"/>
           </w:tcPr>
           <w:p>
+            <w:pPr>
+              <w:spacing w:after="0"/>
+            </w:pPr>
             <w:r>
               <w:rPr>
                 <w:b/>
                 <w:color w:val="FFFFFF"/>
-                <w:sz w:val="15"/>
+                <w:sz w:val="17"/>
               </w:rPr>
               <w:t>Situação</w:t>
             </w:r>
@@ -5183,15 +5291,25 @@
         </w:tc>
         <w:tc>
           <w:tcPr>
-            <w:tcW w:w="4896" w:type="dxa"/>
+            <w:tcW w:w="3960" w:type="dxa"/>
             <w:shd w:val="clear" w:color="auto" w:fill="1F4E78"/>
+            <w:tcMar>
+              <w:top w:w="60" w:type="dxa"/>
+              <w:left w:w="100" w:type="dxa"/>
+              <w:bottom w:w="60" w:type="dxa"/>
+              <w:right w:w="100" w:type="dxa"/>
+            </w:tcMar>
+            <w:vAlign w:val="center"/>
           </w:tcPr>
           <w:p>
+            <w:pPr>
+              <w:spacing w:after="0"/>
+            </w:pPr>
             <w:r>
               <w:rPr>
                 <w:b/>
                 <w:color w:val="FFFFFF"/>
-                <w:sz w:val="15"/>
+                <w:sz w:val="17"/>
               </w:rPr>
               <w:t>Principais evidências</w:t>
             </w:r>
@@ -5205,7 +5323,13 @@
         </w:trPr>
         <w:tc>
           <w:tcPr>
-            <w:tcW w:w="3024" w:type="dxa"/>
+            <w:tcW w:w="3168" w:type="dxa"/>
+            <w:tcMar>
+              <w:top w:w="60" w:type="dxa"/>
+              <w:left w:w="100" w:type="dxa"/>
+              <w:bottom w:w="60" w:type="dxa"/>
+              <w:right w:w="100" w:type="dxa"/>
+            </w:tcMar>
           </w:tcPr>
           <w:p>
             <w:pPr>
@@ -5213,7 +5337,8 @@
             </w:pPr>
             <w:r>
               <w:rPr>
-                <w:sz w:val="15"/>
+                <w:b/>
+                <w:sz w:val="17"/>
               </w:rPr>
               <w:t>AN01 — Aprender em uma trilha</w:t>
             </w:r>
@@ -5221,7 +5346,13 @@
         </w:tc>
         <w:tc>
           <w:tcPr>
-            <w:tcW w:w="1800" w:type="dxa"/>
+            <w:tcW w:w="2592" w:type="dxa"/>
+            <w:tcMar>
+              <w:top w:w="60" w:type="dxa"/>
+              <w:left w:w="100" w:type="dxa"/>
+              <w:bottom w:w="60" w:type="dxa"/>
+              <w:right w:w="100" w:type="dxa"/>
+            </w:tcMar>
           </w:tcPr>
           <w:p>
             <w:pPr>
@@ -5229,7 +5360,7 @@
             </w:pPr>
             <w:r>
               <w:rPr>
-                <w:sz w:val="15"/>
+                <w:sz w:val="17"/>
               </w:rPr>
               <w:t>Implementada no escopo auditado</w:t>
             </w:r>
@@ -5237,7 +5368,13 @@
         </w:tc>
         <w:tc>
           <w:tcPr>
-            <w:tcW w:w="4896" w:type="dxa"/>
+            <w:tcW w:w="3960" w:type="dxa"/>
+            <w:tcMar>
+              <w:top w:w="60" w:type="dxa"/>
+              <w:left w:w="100" w:type="dxa"/>
+              <w:bottom w:w="60" w:type="dxa"/>
+              <w:right w:w="100" w:type="dxa"/>
+            </w:tcMar>
           </w:tcPr>
           <w:p>
             <w:pPr>
@@ -5245,7 +5382,7 @@
             </w:pPr>
             <w:r>
               <w:rPr>
-                <w:sz w:val="15"/>
+                <w:sz w:val="17"/>
               </w:rPr>
               <w:t>src/lib/learning/catalog.ts; assessment.ts; lesson-progress.ts; src/app/trails/LearningJourney.tsx</w:t>
             </w:r>
@@ -5259,7 +5396,13 @@
         </w:trPr>
         <w:tc>
           <w:tcPr>
-            <w:tcW w:w="3024" w:type="dxa"/>
+            <w:tcW w:w="3168" w:type="dxa"/>
+            <w:tcMar>
+              <w:top w:w="60" w:type="dxa"/>
+              <w:left w:w="100" w:type="dxa"/>
+              <w:bottom w:w="60" w:type="dxa"/>
+              <w:right w:w="100" w:type="dxa"/>
+            </w:tcMar>
           </w:tcPr>
           <w:p>
             <w:pPr>
@@ -5267,7 +5410,8 @@
             </w:pPr>
             <w:r>
               <w:rPr>
-                <w:sz w:val="15"/>
+                <w:b/>
+                <w:sz w:val="17"/>
               </w:rPr>
               <w:t>AN02 — Participar de duelo</w:t>
             </w:r>
@@ -5275,7 +5419,13 @@
         </w:tc>
         <w:tc>
           <w:tcPr>
-            <w:tcW w:w="1800" w:type="dxa"/>
+            <w:tcW w:w="2592" w:type="dxa"/>
+            <w:tcMar>
+              <w:top w:w="60" w:type="dxa"/>
+              <w:left w:w="100" w:type="dxa"/>
+              <w:bottom w:w="60" w:type="dxa"/>
+              <w:right w:w="100" w:type="dxa"/>
+            </w:tcMar>
           </w:tcPr>
           <w:p>
             <w:pPr>
@@ -5283,7 +5433,7 @@
             </w:pPr>
             <w:r>
               <w:rPr>
-                <w:sz w:val="15"/>
+                <w:sz w:val="17"/>
               </w:rPr>
               <w:t>Parcial</w:t>
             </w:r>
@@ -5291,7 +5441,13 @@
         </w:tc>
         <w:tc>
           <w:tcPr>
-            <w:tcW w:w="4896" w:type="dxa"/>
+            <w:tcW w:w="3960" w:type="dxa"/>
+            <w:tcMar>
+              <w:top w:w="60" w:type="dxa"/>
+              <w:left w:w="100" w:type="dxa"/>
+              <w:bottom w:w="60" w:type="dxa"/>
+              <w:right w:w="100" w:type="dxa"/>
+            </w:tcMar>
           </w:tcPr>
           <w:p>
             <w:pPr>
@@ -5299,7 +5455,7 @@
             </w:pPr>
             <w:r>
               <w:rPr>
-                <w:sz w:val="15"/>
+                <w:sz w:val="17"/>
               </w:rPr>
               <w:t>src/app/api/duels/route.ts; src/services/duel.service.ts; src/lib/duels/{judge,resolution,resolution-policy,lifecycle}.ts</w:t>
             </w:r>
@@ -5313,7 +5469,13 @@
         </w:trPr>
         <w:tc>
           <w:tcPr>
-            <w:tcW w:w="3024" w:type="dxa"/>
+            <w:tcW w:w="3168" w:type="dxa"/>
+            <w:tcMar>
+              <w:top w:w="60" w:type="dxa"/>
+              <w:left w:w="100" w:type="dxa"/>
+              <w:bottom w:w="60" w:type="dxa"/>
+              <w:right w:w="100" w:type="dxa"/>
+            </w:tcMar>
           </w:tcPr>
           <w:p>
             <w:pPr>
@@ -5321,15 +5483,23 @@
             </w:pPr>
             <w:r>
               <w:rPr>
-                <w:sz w:val="15"/>
+                <w:b/>
+                <w:sz w:val="17"/>
               </w:rPr>
+              <w:lastRenderedPageBreak/>
               <w:t>AN03 — Resolver exercício</w:t>
             </w:r>
           </w:p>
         </w:tc>
         <w:tc>
           <w:tcPr>
-            <w:tcW w:w="1800" w:type="dxa"/>
+            <w:tcW w:w="2592" w:type="dxa"/>
+            <w:tcMar>
+              <w:top w:w="60" w:type="dxa"/>
+              <w:left w:w="100" w:type="dxa"/>
+              <w:bottom w:w="60" w:type="dxa"/>
+              <w:right w:w="100" w:type="dxa"/>
+            </w:tcMar>
           </w:tcPr>
           <w:p>
             <w:pPr>
@@ -5337,7 +5507,7 @@
             </w:pPr>
             <w:r>
               <w:rPr>
-                <w:sz w:val="15"/>
+                <w:sz w:val="17"/>
               </w:rPr>
               <w:t>Implementada no escopo auditado</w:t>
             </w:r>
@@ -5345,7 +5515,13 @@
         </w:tc>
         <w:tc>
           <w:tcPr>
-            <w:tcW w:w="4896" w:type="dxa"/>
+            <w:tcW w:w="3960" w:type="dxa"/>
+            <w:tcMar>
+              <w:top w:w="60" w:type="dxa"/>
+              <w:left w:w="100" w:type="dxa"/>
+              <w:bottom w:w="60" w:type="dxa"/>
+              <w:right w:w="100" w:type="dxa"/>
+            </w:tcMar>
           </w:tcPr>
           <w:p>
             <w:pPr>
@@ -5353,7 +5529,7 @@
             </w:pPr>
             <w:r>
               <w:rPr>
-                <w:sz w:val="15"/>
+                <w:sz w:val="17"/>
               </w:rPr>
               <w:t>src/app/api/lessons/[lessonId]/attempt/route.ts; src/lib/learning/assessment.ts; src/lib/exercises/evaluator.ts; src/lib/learning/transaction.ts</w:t>
             </w:r>
@@ -5367,7 +5543,13 @@
         </w:trPr>
         <w:tc>
           <w:tcPr>
-            <w:tcW w:w="3024" w:type="dxa"/>
+            <w:tcW w:w="3168" w:type="dxa"/>
+            <w:tcMar>
+              <w:top w:w="60" w:type="dxa"/>
+              <w:left w:w="100" w:type="dxa"/>
+              <w:bottom w:w="60" w:type="dxa"/>
+              <w:right w:w="100" w:type="dxa"/>
+            </w:tcMar>
           </w:tcPr>
           <w:p>
             <w:pPr>
@@ -5375,7 +5557,8 @@
             </w:pPr>
             <w:r>
               <w:rPr>
-                <w:sz w:val="15"/>
+                <w:b/>
+                <w:sz w:val="17"/>
               </w:rPr>
               <w:t>AN04 — Registrar XP e consultar evolução</w:t>
             </w:r>
@@ -5383,7 +5566,13 @@
         </w:tc>
         <w:tc>
           <w:tcPr>
-            <w:tcW w:w="1800" w:type="dxa"/>
+            <w:tcW w:w="2592" w:type="dxa"/>
+            <w:tcMar>
+              <w:top w:w="60" w:type="dxa"/>
+              <w:left w:w="100" w:type="dxa"/>
+              <w:bottom w:w="60" w:type="dxa"/>
+              <w:right w:w="100" w:type="dxa"/>
+            </w:tcMar>
           </w:tcPr>
           <w:p>
             <w:pPr>
@@ -5391,7 +5580,7 @@
             </w:pPr>
             <w:r>
               <w:rPr>
-                <w:sz w:val="15"/>
+                <w:sz w:val="17"/>
               </w:rPr>
               <w:t>Implementada no escopo auditado</w:t>
             </w:r>
@@ -5399,7 +5588,13 @@
         </w:tc>
         <w:tc>
           <w:tcPr>
-            <w:tcW w:w="4896" w:type="dxa"/>
+            <w:tcW w:w="3960" w:type="dxa"/>
+            <w:tcMar>
+              <w:top w:w="60" w:type="dxa"/>
+              <w:left w:w="100" w:type="dxa"/>
+              <w:bottom w:w="60" w:type="dxa"/>
+              <w:right w:w="100" w:type="dxa"/>
+            </w:tcMar>
           </w:tcPr>
           <w:p>
             <w:pPr>
@@ -5407,7 +5602,7 @@
             </w:pPr>
             <w:r>
               <w:rPr>
-                <w:sz w:val="15"/>
+                <w:sz w:val="17"/>
               </w:rPr>
               <w:t>src/lib/learning/rewards.ts; lesson-progress.ts; language-xp.ts; src/lib/xp.ts</w:t>
             </w:r>
@@ -5421,7 +5616,13 @@
         </w:trPr>
         <w:tc>
           <w:tcPr>
-            <w:tcW w:w="3024" w:type="dxa"/>
+            <w:tcW w:w="3168" w:type="dxa"/>
+            <w:tcMar>
+              <w:top w:w="60" w:type="dxa"/>
+              <w:left w:w="100" w:type="dxa"/>
+              <w:bottom w:w="60" w:type="dxa"/>
+              <w:right w:w="100" w:type="dxa"/>
+            </w:tcMar>
           </w:tcPr>
           <w:p>
             <w:pPr>
@@ -5429,16 +5630,22 @@
             </w:pPr>
             <w:r>
               <w:rPr>
-                <w:sz w:val="15"/>
+                <w:b/>
+                <w:sz w:val="17"/>
               </w:rPr>
-              <w:lastRenderedPageBreak/>
               <w:t>AN05 — Interagir com a comunidade</w:t>
             </w:r>
           </w:p>
         </w:tc>
         <w:tc>
           <w:tcPr>
-            <w:tcW w:w="1800" w:type="dxa"/>
+            <w:tcW w:w="2592" w:type="dxa"/>
+            <w:tcMar>
+              <w:top w:w="60" w:type="dxa"/>
+              <w:left w:w="100" w:type="dxa"/>
+              <w:bottom w:w="60" w:type="dxa"/>
+              <w:right w:w="100" w:type="dxa"/>
+            </w:tcMar>
           </w:tcPr>
           <w:p>
             <w:pPr>
@@ -5446,7 +5653,7 @@
             </w:pPr>
             <w:r>
               <w:rPr>
-                <w:sz w:val="15"/>
+                <w:sz w:val="17"/>
               </w:rPr>
               <w:t>Implementada no escopo auditado</w:t>
             </w:r>
@@ -5454,7 +5661,13 @@
         </w:tc>
         <w:tc>
           <w:tcPr>
-            <w:tcW w:w="4896" w:type="dxa"/>
+            <w:tcW w:w="3960" w:type="dxa"/>
+            <w:tcMar>
+              <w:top w:w="60" w:type="dxa"/>
+              <w:left w:w="100" w:type="dxa"/>
+              <w:bottom w:w="60" w:type="dxa"/>
+              <w:right w:w="100" w:type="dxa"/>
+            </w:tcMar>
           </w:tcPr>
           <w:p>
             <w:pPr>
@@ -5462,7 +5675,7 @@
             </w:pPr>
             <w:r>
               <w:rPr>
-                <w:sz w:val="15"/>
+                <w:sz w:val="17"/>
               </w:rPr>
               <w:t>src/app/feed; src/app/api/posts; src/app/api/admin/reports</w:t>
             </w:r>
@@ -5476,7 +5689,13 @@
         </w:trPr>
         <w:tc>
           <w:tcPr>
-            <w:tcW w:w="3024" w:type="dxa"/>
+            <w:tcW w:w="3168" w:type="dxa"/>
+            <w:tcMar>
+              <w:top w:w="60" w:type="dxa"/>
+              <w:left w:w="100" w:type="dxa"/>
+              <w:bottom w:w="60" w:type="dxa"/>
+              <w:right w:w="100" w:type="dxa"/>
+            </w:tcMar>
           </w:tcPr>
           <w:p>
             <w:pPr>
@@ -5484,15 +5703,22 @@
             </w:pPr>
             <w:r>
               <w:rPr>
-                <w:sz w:val="15"/>
+                <w:b/>
+                <w:sz w:val="17"/>
               </w:rPr>
-              <w:t>AN06 — Consultar ajuda editorial</w:t>
+              <w:t>AN06 — Consultar ajuda do exercício</w:t>
             </w:r>
           </w:p>
         </w:tc>
         <w:tc>
           <w:tcPr>
-            <w:tcW w:w="1800" w:type="dxa"/>
+            <w:tcW w:w="2592" w:type="dxa"/>
+            <w:tcMar>
+              <w:top w:w="60" w:type="dxa"/>
+              <w:left w:w="100" w:type="dxa"/>
+              <w:bottom w:w="60" w:type="dxa"/>
+              <w:right w:w="100" w:type="dxa"/>
+            </w:tcMar>
           </w:tcPr>
           <w:p>
             <w:pPr>
@@ -5500,7 +5726,7 @@
             </w:pPr>
             <w:r>
               <w:rPr>
-                <w:sz w:val="15"/>
+                <w:sz w:val="17"/>
               </w:rPr>
               <w:t>Parcial</w:t>
             </w:r>
@@ -5508,7 +5734,13 @@
         </w:tc>
         <w:tc>
           <w:tcPr>
-            <w:tcW w:w="4896" w:type="dxa"/>
+            <w:tcW w:w="3960" w:type="dxa"/>
+            <w:tcMar>
+              <w:top w:w="60" w:type="dxa"/>
+              <w:left w:w="100" w:type="dxa"/>
+              <w:bottom w:w="60" w:type="dxa"/>
+              <w:right w:w="100" w:type="dxa"/>
+            </w:tcMar>
           </w:tcPr>
           <w:p>
             <w:pPr>
@@ -5516,7 +5748,7 @@
             </w:pPr>
             <w:r>
               <w:rPr>
-                <w:sz w:val="15"/>
+                <w:sz w:val="17"/>
               </w:rPr>
               <w:t>src/components/lesson/AssistanceControls.tsx; src/lib/exercises/repository.ts; src/app/api/exercises/[exerciseId]/events/route.ts</w:t>
             </w:r>
@@ -5530,7 +5762,13 @@
         </w:trPr>
         <w:tc>
           <w:tcPr>
-            <w:tcW w:w="3024" w:type="dxa"/>
+            <w:tcW w:w="3168" w:type="dxa"/>
+            <w:tcMar>
+              <w:top w:w="60" w:type="dxa"/>
+              <w:left w:w="100" w:type="dxa"/>
+              <w:bottom w:w="60" w:type="dxa"/>
+              <w:right w:w="100" w:type="dxa"/>
+            </w:tcMar>
           </w:tcPr>
           <w:p>
             <w:pPr>
@@ -5538,7 +5776,8 @@
             </w:pPr>
             <w:r>
               <w:rPr>
-                <w:sz w:val="15"/>
+                <w:b/>
+                <w:sz w:val="17"/>
               </w:rPr>
               <w:t>AN07 — Atuar como avaliador</w:t>
             </w:r>
@@ -5546,7 +5785,13 @@
         </w:tc>
         <w:tc>
           <w:tcPr>
-            <w:tcW w:w="1800" w:type="dxa"/>
+            <w:tcW w:w="2592" w:type="dxa"/>
+            <w:tcMar>
+              <w:top w:w="60" w:type="dxa"/>
+              <w:left w:w="100" w:type="dxa"/>
+              <w:bottom w:w="60" w:type="dxa"/>
+              <w:right w:w="100" w:type="dxa"/>
+            </w:tcMar>
           </w:tcPr>
           <w:p>
             <w:pPr>
@@ -5554,7 +5799,7 @@
             </w:pPr>
             <w:r>
               <w:rPr>
-                <w:sz w:val="15"/>
+                <w:sz w:val="17"/>
               </w:rPr>
               <w:t>Implementada no escopo auditado</w:t>
             </w:r>
@@ -5562,7 +5807,13 @@
         </w:tc>
         <w:tc>
           <w:tcPr>
-            <w:tcW w:w="4896" w:type="dxa"/>
+            <w:tcW w:w="3960" w:type="dxa"/>
+            <w:tcMar>
+              <w:top w:w="60" w:type="dxa"/>
+              <w:left w:w="100" w:type="dxa"/>
+              <w:bottom w:w="60" w:type="dxa"/>
+              <w:right w:w="100" w:type="dxa"/>
+            </w:tcMar>
           </w:tcPr>
           <w:p>
             <w:pPr>
@@ -5570,7 +5821,7 @@
             </w:pPr>
             <w:r>
               <w:rPr>
-                <w:sz w:val="15"/>
+                <w:sz w:val="17"/>
               </w:rPr>
               <w:t>src/services/evaluator.service.ts; src/app/api/evaluators; src/app/api/admin/evaluators; src/app/api/evaluations</w:t>
             </w:r>
@@ -5584,7 +5835,13 @@
         </w:trPr>
         <w:tc>
           <w:tcPr>
-            <w:tcW w:w="3024" w:type="dxa"/>
+            <w:tcW w:w="3168" w:type="dxa"/>
+            <w:tcMar>
+              <w:top w:w="60" w:type="dxa"/>
+              <w:left w:w="100" w:type="dxa"/>
+              <w:bottom w:w="60" w:type="dxa"/>
+              <w:right w:w="100" w:type="dxa"/>
+            </w:tcMar>
           </w:tcPr>
           <w:p>
             <w:pPr>
@@ -5592,7 +5849,8 @@
             </w:pPr>
             <w:r>
               <w:rPr>
-                <w:sz w:val="15"/>
+                <w:b/>
+                <w:sz w:val="17"/>
               </w:rPr>
               <w:t>AN08 — Empresa divulgar vaga</w:t>
             </w:r>
@@ -5600,7 +5858,13 @@
         </w:tc>
         <w:tc>
           <w:tcPr>
-            <w:tcW w:w="1800" w:type="dxa"/>
+            <w:tcW w:w="2592" w:type="dxa"/>
+            <w:tcMar>
+              <w:top w:w="60" w:type="dxa"/>
+              <w:left w:w="100" w:type="dxa"/>
+              <w:bottom w:w="60" w:type="dxa"/>
+              <w:right w:w="100" w:type="dxa"/>
+            </w:tcMar>
           </w:tcPr>
           <w:p>
             <w:pPr>
@@ -5608,7 +5872,7 @@
             </w:pPr>
             <w:r>
               <w:rPr>
-                <w:sz w:val="15"/>
+                <w:sz w:val="17"/>
               </w:rPr>
               <w:t>Parcial</w:t>
             </w:r>
@@ -5616,7 +5880,13 @@
         </w:tc>
         <w:tc>
           <w:tcPr>
-            <w:tcW w:w="4896" w:type="dxa"/>
+            <w:tcW w:w="3960" w:type="dxa"/>
+            <w:tcMar>
+              <w:top w:w="60" w:type="dxa"/>
+              <w:left w:w="100" w:type="dxa"/>
+              <w:bottom w:w="60" w:type="dxa"/>
+              <w:right w:w="100" w:type="dxa"/>
+            </w:tcMar>
           </w:tcPr>
           <w:p>
             <w:pPr>
@@ -5624,7 +5894,7 @@
             </w:pPr>
             <w:r>
               <w:rPr>
-                <w:sz w:val="15"/>
+                <w:sz w:val="17"/>
               </w:rPr>
               <w:t>src/app/api/companies; src/app/api/jobs; src/services/job.service.ts; src/app/recruiter</w:t>
             </w:r>
@@ -5638,7 +5908,13 @@
         </w:trPr>
         <w:tc>
           <w:tcPr>
-            <w:tcW w:w="3024" w:type="dxa"/>
+            <w:tcW w:w="3168" w:type="dxa"/>
+            <w:tcMar>
+              <w:top w:w="60" w:type="dxa"/>
+              <w:left w:w="100" w:type="dxa"/>
+              <w:bottom w:w="60" w:type="dxa"/>
+              <w:right w:w="100" w:type="dxa"/>
+            </w:tcMar>
           </w:tcPr>
           <w:p>
             <w:pPr>
@@ -5646,7 +5922,8 @@
             </w:pPr>
             <w:r>
               <w:rPr>
-                <w:sz w:val="15"/>
+                <w:b/>
+                <w:sz w:val="17"/>
               </w:rPr>
               <w:t>AN09 — Administração da plataforma</w:t>
             </w:r>
@@ -5654,7 +5931,13 @@
         </w:tc>
         <w:tc>
           <w:tcPr>
-            <w:tcW w:w="1800" w:type="dxa"/>
+            <w:tcW w:w="2592" w:type="dxa"/>
+            <w:tcMar>
+              <w:top w:w="60" w:type="dxa"/>
+              <w:left w:w="100" w:type="dxa"/>
+              <w:bottom w:w="60" w:type="dxa"/>
+              <w:right w:w="100" w:type="dxa"/>
+            </w:tcMar>
           </w:tcPr>
           <w:p>
             <w:pPr>
@@ -5662,7 +5945,7 @@
             </w:pPr>
             <w:r>
               <w:rPr>
-                <w:sz w:val="15"/>
+                <w:sz w:val="17"/>
               </w:rPr>
               <w:t>Parcial</w:t>
             </w:r>
@@ -5670,7 +5953,13 @@
         </w:tc>
         <w:tc>
           <w:tcPr>
-            <w:tcW w:w="4896" w:type="dxa"/>
+            <w:tcW w:w="3960" w:type="dxa"/>
+            <w:tcMar>
+              <w:top w:w="60" w:type="dxa"/>
+              <w:left w:w="100" w:type="dxa"/>
+              <w:bottom w:w="60" w:type="dxa"/>
+              <w:right w:w="100" w:type="dxa"/>
+            </w:tcMar>
           </w:tcPr>
           <w:p>
             <w:pPr>
@@ -5678,7 +5967,7 @@
             </w:pPr>
             <w:r>
               <w:rPr>
-                <w:sz w:val="15"/>
+                <w:sz w:val="17"/>
               </w:rPr>
               <w:t>src/app/admin; src/app/api/admin; src/services/admin.service.ts</w:t>
             </w:r>
@@ -5713,7 +6002,7 @@
 </file>
 
 <file path=word/endnotes.xml><?xml version="1.0" encoding="utf-8"?>
-<w:endnotes xmlns:wpc="http://schemas.microsoft.com/office/word/2010/wordprocessingCanvas" xmlns:cx="http://schemas.microsoft.com/office/drawing/2014/chartex" xmlns:cx1="http://schemas.microsoft.com/office/drawing/2015/9/8/chartex" xmlns:cx2="http://schemas.microsoft.com/office/drawing/2015/10/21/chartex" xmlns:cx3="http://schemas.microsoft.com/office/drawing/2016/5/9/chartex" xmlns:cx4="http://schemas.microsoft.com/office/drawing/2016/5/10/chartex" xmlns:cx5="http://schemas.microsoft.com/office/drawing/2016/5/11/chartex" xmlns:cx6="http://schemas.microsoft.com/office/drawing/2016/5/12/chartex" xmlns:cx7="http://schemas.microsoft.com/office/drawing/2016/5/13/chartex" xmlns:cx8="http://schemas.microsoft.com/office/drawing/2016/5/14/chartex" xmlns:mc="http://schemas.openxmlformats.org/markup-compatibility/2006" xmlns:aink="http://schemas.microsoft.com/office/drawing/2016/ink" xmlns:am3d="http://schemas.microsoft.com/office/drawing/2017/model3d" xmlns:o="urn:schemas-microsoft-com:office:office" xmlns:oel="http://schemas.microsoft.com/office/2019/extlst" xmlns:r="http://schemas.openxmlformats.org/officeDocument/2006/relationships" xmlns:m="http://schemas.openxmlformats.org/officeDocument/2006/math" xmlns:v="urn:schemas-microsoft-com:vml" xmlns:wp14="http://schemas.microsoft.com/office/word/2010/wordprocessingDrawing" xmlns:wp="http://schemas.openxmlformats.org/drawingml/2006/wordprocessingDrawing" xmlns:w10="urn:schemas-microsoft-com:office:word" xmlns:w="http://schemas.openxmlformats.org/wordprocessingml/2006/main" xmlns:w14="http://schemas.microsoft.com/office/word/2010/wordml" xmlns:w15="http://schemas.microsoft.com/office/word/2012/wordml" xmlns:w16cex="http://schemas.microsoft.com/office/word/2018/wordml/cex" xmlns:w16cid="http://schemas.microsoft.com/office/word/2016/wordml/cid" xmlns:w16="http://schemas.microsoft.com/office/word/2018/wordml" xmlns:w16sdtdh="http://schemas.microsoft.com/office/word/2020/wordml/sdtdatahash" xmlns:w16se="http://schemas.microsoft.com/office/word/2015/wordml/symex" xmlns:wpg="http://schemas.microsoft.com/office/word/2010/wordprocessingGroup" xmlns:wpi="http://schemas.microsoft.com/office/word/2010/wordprocessingInk" xmlns:wne="http://schemas.microsoft.com/office/word/2006/wordml" xmlns:wps="http://schemas.microsoft.com/office/word/2010/wordprocessingShape" mc:Ignorable="w14 w15 w16se w16cid w16 w16cex w16sdtdh wp14">
+<w:endnotes xmlns:wpc="http://schemas.microsoft.com/office/word/2010/wordprocessingCanvas" xmlns:cx="http://schemas.microsoft.com/office/drawing/2014/chartex" xmlns:cx1="http://schemas.microsoft.com/office/drawing/2015/9/8/chartex" xmlns:cx2="http://schemas.microsoft.com/office/drawing/2015/10/21/chartex" xmlns:cx3="http://schemas.microsoft.com/office/drawing/2016/5/9/chartex" xmlns:cx4="http://schemas.microsoft.com/office/drawing/2016/5/10/chartex" xmlns:cx5="http://schemas.microsoft.com/office/drawing/2016/5/11/chartex" xmlns:cx6="http://schemas.microsoft.com/office/drawing/2016/5/12/chartex" xmlns:cx7="http://schemas.microsoft.com/office/drawing/2016/5/13/chartex" xmlns:cx8="http://schemas.microsoft.com/office/drawing/2016/5/14/chartex" xmlns:mc="http://schemas.openxmlformats.org/markup-compatibility/2006" xmlns:aink="http://schemas.microsoft.com/office/drawing/2016/ink" xmlns:am3d="http://schemas.microsoft.com/office/drawing/2017/model3d" xmlns:o="urn:schemas-microsoft-com:office:office" xmlns:oel="http://schemas.microsoft.com/office/2019/extlst" xmlns:r="http://schemas.openxmlformats.org/officeDocument/2006/relationships" xmlns:m="http://schemas.openxmlformats.org/officeDocument/2006/math" xmlns:v="urn:schemas-microsoft-com:vml" xmlns:wp14="http://schemas.microsoft.com/office/word/2010/wordprocessingDrawing" xmlns:wp="http://schemas.openxmlformats.org/drawingml/2006/wordprocessingDrawing" xmlns:w10="urn:schemas-microsoft-com:office:word" xmlns:w="http://schemas.openxmlformats.org/wordprocessingml/2006/main" xmlns:w14="http://schemas.microsoft.com/office/word/2010/wordml" xmlns:w15="http://schemas.microsoft.com/office/word/2012/wordml" xmlns:w16cex="http://schemas.microsoft.com/office/word/2018/wordml/cex" xmlns:w16cid="http://schemas.microsoft.com/office/word/2016/wordml/cid" xmlns:w16="http://schemas.microsoft.com/office/word/2018/wordml" xmlns:w16du="http://schemas.microsoft.com/office/word/2023/wordml/word16du" xmlns:w16sdtdh="http://schemas.microsoft.com/office/word/2020/wordml/sdtdatahash" xmlns:w16sdtfl="http://schemas.microsoft.com/office/word/2024/wordml/sdtformatlock" xmlns:w16se="http://schemas.microsoft.com/office/word/2015/wordml/symex" xmlns:wpg="http://schemas.microsoft.com/office/word/2010/wordprocessingGroup" xmlns:wpi="http://schemas.microsoft.com/office/word/2010/wordprocessingInk" xmlns:wne="http://schemas.microsoft.com/office/word/2006/wordml" xmlns:wps="http://schemas.microsoft.com/office/word/2010/wordprocessingShape" mc:Ignorable="w14 w15 w16se w16cid w16 w16cex w16sdtdh w16sdtfl w16du wp14">
   <w:endnote w:type="separator" w:id="-1">
     <w:p>
       <w:r>
@@ -5732,7 +6021,7 @@
 </file>
 
 <file path=word/footer1.xml><?xml version="1.0" encoding="utf-8"?>
-<w:ftr xmlns:wpc="http://schemas.microsoft.com/office/word/2010/wordprocessingCanvas" xmlns:cx="http://schemas.microsoft.com/office/drawing/2014/chartex" xmlns:cx1="http://schemas.microsoft.com/office/drawing/2015/9/8/chartex" xmlns:cx2="http://schemas.microsoft.com/office/drawing/2015/10/21/chartex" xmlns:cx3="http://schemas.microsoft.com/office/drawing/2016/5/9/chartex" xmlns:cx4="http://schemas.microsoft.com/office/drawing/2016/5/10/chartex" xmlns:cx5="http://schemas.microsoft.com/office/drawing/2016/5/11/chartex" xmlns:cx6="http://schemas.microsoft.com/office/drawing/2016/5/12/chartex" xmlns:cx7="http://schemas.microsoft.com/office/drawing/2016/5/13/chartex" xmlns:cx8="http://schemas.microsoft.com/office/drawing/2016/5/14/chartex" xmlns:mc="http://schemas.openxmlformats.org/markup-compatibility/2006" xmlns:aink="http://schemas.microsoft.com/office/drawing/2016/ink" xmlns:am3d="http://schemas.microsoft.com/office/drawing/2017/model3d" xmlns:o="urn:schemas-microsoft-com:office:office" xmlns:oel="http://schemas.microsoft.com/office/2019/extlst" xmlns:r="http://schemas.openxmlformats.org/officeDocument/2006/relationships" xmlns:m="http://schemas.openxmlformats.org/officeDocument/2006/math" xmlns:v="urn:schemas-microsoft-com:vml" xmlns:wp14="http://schemas.microsoft.com/office/word/2010/wordprocessingDrawing" xmlns:wp="http://schemas.openxmlformats.org/drawingml/2006/wordprocessingDrawing" xmlns:w10="urn:schemas-microsoft-com:office:word" xmlns:w="http://schemas.openxmlformats.org/wordprocessingml/2006/main" xmlns:w14="http://schemas.microsoft.com/office/word/2010/wordml" xmlns:w15="http://schemas.microsoft.com/office/word/2012/wordml" xmlns:w16cex="http://schemas.microsoft.com/office/word/2018/wordml/cex" xmlns:w16cid="http://schemas.microsoft.com/office/word/2016/wordml/cid" xmlns:w16="http://schemas.microsoft.com/office/word/2018/wordml" xmlns:w16sdtdh="http://schemas.microsoft.com/office/word/2020/wordml/sdtdatahash" xmlns:w16se="http://schemas.microsoft.com/office/word/2015/wordml/symex" xmlns:wpg="http://schemas.microsoft.com/office/word/2010/wordprocessingGroup" xmlns:wpi="http://schemas.microsoft.com/office/word/2010/wordprocessingInk" xmlns:wne="http://schemas.microsoft.com/office/word/2006/wordml" xmlns:wps="http://schemas.microsoft.com/office/word/2010/wordprocessingShape" mc:Ignorable="w14 w15 w16se w16cid w16 w16cex w16sdtdh wp14">
+<w:ftr xmlns:wpc="http://schemas.microsoft.com/office/word/2010/wordprocessingCanvas" xmlns:cx="http://schemas.microsoft.com/office/drawing/2014/chartex" xmlns:cx1="http://schemas.microsoft.com/office/drawing/2015/9/8/chartex" xmlns:cx2="http://schemas.microsoft.com/office/drawing/2015/10/21/chartex" xmlns:cx3="http://schemas.microsoft.com/office/drawing/2016/5/9/chartex" xmlns:cx4="http://schemas.microsoft.com/office/drawing/2016/5/10/chartex" xmlns:cx5="http://schemas.microsoft.com/office/drawing/2016/5/11/chartex" xmlns:cx6="http://schemas.microsoft.com/office/drawing/2016/5/12/chartex" xmlns:cx7="http://schemas.microsoft.com/office/drawing/2016/5/13/chartex" xmlns:cx8="http://schemas.microsoft.com/office/drawing/2016/5/14/chartex" xmlns:mc="http://schemas.openxmlformats.org/markup-compatibility/2006" xmlns:aink="http://schemas.microsoft.com/office/drawing/2016/ink" xmlns:am3d="http://schemas.microsoft.com/office/drawing/2017/model3d" xmlns:o="urn:schemas-microsoft-com:office:office" xmlns:oel="http://schemas.microsoft.com/office/2019/extlst" xmlns:r="http://schemas.openxmlformats.org/officeDocument/2006/relationships" xmlns:m="http://schemas.openxmlformats.org/officeDocument/2006/math" xmlns:v="urn:schemas-microsoft-com:vml" xmlns:wp14="http://schemas.microsoft.com/office/word/2010/wordprocessingDrawing" xmlns:wp="http://schemas.openxmlformats.org/drawingml/2006/wordprocessingDrawing" xmlns:w10="urn:schemas-microsoft-com:office:word" xmlns:w="http://schemas.openxmlformats.org/wordprocessingml/2006/main" xmlns:w14="http://schemas.microsoft.com/office/word/2010/wordml" xmlns:w15="http://schemas.microsoft.com/office/word/2012/wordml" xmlns:w16cex="http://schemas.microsoft.com/office/word/2018/wordml/cex" xmlns:w16cid="http://schemas.microsoft.com/office/word/2016/wordml/cid" xmlns:w16="http://schemas.microsoft.com/office/word/2018/wordml" xmlns:w16du="http://schemas.microsoft.com/office/word/2023/wordml/word16du" xmlns:w16sdtdh="http://schemas.microsoft.com/office/word/2020/wordml/sdtdatahash" xmlns:w16sdtfl="http://schemas.microsoft.com/office/word/2024/wordml/sdtformatlock" xmlns:w16se="http://schemas.microsoft.com/office/word/2015/wordml/symex" xmlns:wpg="http://schemas.microsoft.com/office/word/2010/wordprocessingGroup" xmlns:wpi="http://schemas.microsoft.com/office/word/2010/wordprocessingInk" xmlns:wne="http://schemas.microsoft.com/office/word/2006/wordml" xmlns:wps="http://schemas.microsoft.com/office/word/2010/wordprocessingShape" mc:Ignorable="w14 w15 w16se w16cid w16 w16cex w16sdtdh w16sdtfl w16du wp14">
   <w:p>
     <w:pPr>
       <w:pStyle w:val="Rodap"/>
@@ -5783,7 +6072,7 @@
 </file>
 
 <file path=word/footer2.xml><?xml version="1.0" encoding="utf-8"?>
-<w:ftr xmlns:wpc="http://schemas.microsoft.com/office/word/2010/wordprocessingCanvas" xmlns:cx="http://schemas.microsoft.com/office/drawing/2014/chartex" xmlns:cx1="http://schemas.microsoft.com/office/drawing/2015/9/8/chartex" xmlns:cx2="http://schemas.microsoft.com/office/drawing/2015/10/21/chartex" xmlns:cx3="http://schemas.microsoft.com/office/drawing/2016/5/9/chartex" xmlns:cx4="http://schemas.microsoft.com/office/drawing/2016/5/10/chartex" xmlns:cx5="http://schemas.microsoft.com/office/drawing/2016/5/11/chartex" xmlns:cx6="http://schemas.microsoft.com/office/drawing/2016/5/12/chartex" xmlns:cx7="http://schemas.microsoft.com/office/drawing/2016/5/13/chartex" xmlns:cx8="http://schemas.microsoft.com/office/drawing/2016/5/14/chartex" xmlns:mc="http://schemas.openxmlformats.org/markup-compatibility/2006" xmlns:aink="http://schemas.microsoft.com/office/drawing/2016/ink" xmlns:am3d="http://schemas.microsoft.com/office/drawing/2017/model3d" xmlns:o="urn:schemas-microsoft-com:office:office" xmlns:oel="http://schemas.microsoft.com/office/2019/extlst" xmlns:r="http://schemas.openxmlformats.org/officeDocument/2006/relationships" xmlns:m="http://schemas.openxmlformats.org/officeDocument/2006/math" xmlns:v="urn:schemas-microsoft-com:vml" xmlns:wp14="http://schemas.microsoft.com/office/word/2010/wordprocessingDrawing" xmlns:wp="http://schemas.openxmlformats.org/drawingml/2006/wordprocessingDrawing" xmlns:w10="urn:schemas-microsoft-com:office:word" xmlns:w="http://schemas.openxmlformats.org/wordprocessingml/2006/main" xmlns:w14="http://schemas.microsoft.com/office/word/2010/wordml" xmlns:w15="http://schemas.microsoft.com/office/word/2012/wordml" xmlns:w16cex="http://schemas.microsoft.com/office/word/2018/wordml/cex" xmlns:w16cid="http://schemas.microsoft.com/office/word/2016/wordml/cid" xmlns:w16="http://schemas.microsoft.com/office/word/2018/wordml" xmlns:w16sdtdh="http://schemas.microsoft.com/office/word/2020/wordml/sdtdatahash" xmlns:w16se="http://schemas.microsoft.com/office/word/2015/wordml/symex" xmlns:wpg="http://schemas.microsoft.com/office/word/2010/wordprocessingGroup" xmlns:wpi="http://schemas.microsoft.com/office/word/2010/wordprocessingInk" xmlns:wne="http://schemas.microsoft.com/office/word/2006/wordml" xmlns:wps="http://schemas.microsoft.com/office/word/2010/wordprocessingShape" mc:Ignorable="w14 w15 w16se w16cid w16 w16cex w16sdtdh wp14">
+<w:ftr xmlns:wpc="http://schemas.microsoft.com/office/word/2010/wordprocessingCanvas" xmlns:cx="http://schemas.microsoft.com/office/drawing/2014/chartex" xmlns:cx1="http://schemas.microsoft.com/office/drawing/2015/9/8/chartex" xmlns:cx2="http://schemas.microsoft.com/office/drawing/2015/10/21/chartex" xmlns:cx3="http://schemas.microsoft.com/office/drawing/2016/5/9/chartex" xmlns:cx4="http://schemas.microsoft.com/office/drawing/2016/5/10/chartex" xmlns:cx5="http://schemas.microsoft.com/office/drawing/2016/5/11/chartex" xmlns:cx6="http://schemas.microsoft.com/office/drawing/2016/5/12/chartex" xmlns:cx7="http://schemas.microsoft.com/office/drawing/2016/5/13/chartex" xmlns:cx8="http://schemas.microsoft.com/office/drawing/2016/5/14/chartex" xmlns:mc="http://schemas.openxmlformats.org/markup-compatibility/2006" xmlns:aink="http://schemas.microsoft.com/office/drawing/2016/ink" xmlns:am3d="http://schemas.microsoft.com/office/drawing/2017/model3d" xmlns:o="urn:schemas-microsoft-com:office:office" xmlns:oel="http://schemas.microsoft.com/office/2019/extlst" xmlns:r="http://schemas.openxmlformats.org/officeDocument/2006/relationships" xmlns:m="http://schemas.openxmlformats.org/officeDocument/2006/math" xmlns:v="urn:schemas-microsoft-com:vml" xmlns:wp14="http://schemas.microsoft.com/office/word/2010/wordprocessingDrawing" xmlns:wp="http://schemas.openxmlformats.org/drawingml/2006/wordprocessingDrawing" xmlns:w10="urn:schemas-microsoft-com:office:word" xmlns:w="http://schemas.openxmlformats.org/wordprocessingml/2006/main" xmlns:w14="http://schemas.microsoft.com/office/word/2010/wordml" xmlns:w15="http://schemas.microsoft.com/office/word/2012/wordml" xmlns:w16cex="http://schemas.microsoft.com/office/word/2018/wordml/cex" xmlns:w16cid="http://schemas.microsoft.com/office/word/2016/wordml/cid" xmlns:w16="http://schemas.microsoft.com/office/word/2018/wordml" xmlns:w16du="http://schemas.microsoft.com/office/word/2023/wordml/word16du" xmlns:w16sdtdh="http://schemas.microsoft.com/office/word/2020/wordml/sdtdatahash" xmlns:w16sdtfl="http://schemas.microsoft.com/office/word/2024/wordml/sdtformatlock" xmlns:w16se="http://schemas.microsoft.com/office/word/2015/wordml/symex" xmlns:wpg="http://schemas.microsoft.com/office/word/2010/wordprocessingGroup" xmlns:wpi="http://schemas.microsoft.com/office/word/2010/wordprocessingInk" xmlns:wne="http://schemas.microsoft.com/office/word/2006/wordml" xmlns:wps="http://schemas.microsoft.com/office/word/2010/wordprocessingShape" mc:Ignorable="w14 w15 w16se w16cid w16 w16cex w16sdtdh w16sdtfl w16du wp14">
   <w:tbl>
     <w:tblPr>
       <w:tblW w:w="9864" w:type="dxa"/>
@@ -5900,7 +6189,7 @@
 </file>
 
 <file path=word/footer3.xml><?xml version="1.0" encoding="utf-8"?>
-<w:ftr xmlns:wpc="http://schemas.microsoft.com/office/word/2010/wordprocessingCanvas" xmlns:cx="http://schemas.microsoft.com/office/drawing/2014/chartex" xmlns:cx1="http://schemas.microsoft.com/office/drawing/2015/9/8/chartex" xmlns:cx2="http://schemas.microsoft.com/office/drawing/2015/10/21/chartex" xmlns:cx3="http://schemas.microsoft.com/office/drawing/2016/5/9/chartex" xmlns:cx4="http://schemas.microsoft.com/office/drawing/2016/5/10/chartex" xmlns:cx5="http://schemas.microsoft.com/office/drawing/2016/5/11/chartex" xmlns:cx6="http://schemas.microsoft.com/office/drawing/2016/5/12/chartex" xmlns:cx7="http://schemas.microsoft.com/office/drawing/2016/5/13/chartex" xmlns:cx8="http://schemas.microsoft.com/office/drawing/2016/5/14/chartex" xmlns:mc="http://schemas.openxmlformats.org/markup-compatibility/2006" xmlns:aink="http://schemas.microsoft.com/office/drawing/2016/ink" xmlns:am3d="http://schemas.microsoft.com/office/drawing/2017/model3d" xmlns:o="urn:schemas-microsoft-com:office:office" xmlns:oel="http://schemas.microsoft.com/office/2019/extlst" xmlns:r="http://schemas.openxmlformats.org/officeDocument/2006/relationships" xmlns:m="http://schemas.openxmlformats.org/officeDocument/2006/math" xmlns:v="urn:schemas-microsoft-com:vml" xmlns:wp14="http://schemas.microsoft.com/office/word/2010/wordprocessingDrawing" xmlns:wp="http://schemas.openxmlformats.org/drawingml/2006/wordprocessingDrawing" xmlns:w10="urn:schemas-microsoft-com:office:word" xmlns:w="http://schemas.openxmlformats.org/wordprocessingml/2006/main" xmlns:w14="http://schemas.microsoft.com/office/word/2010/wordml" xmlns:w15="http://schemas.microsoft.com/office/word/2012/wordml" xmlns:w16cex="http://schemas.microsoft.com/office/word/2018/wordml/cex" xmlns:w16cid="http://schemas.microsoft.com/office/word/2016/wordml/cid" xmlns:w16="http://schemas.microsoft.com/office/word/2018/wordml" xmlns:w16sdtdh="http://schemas.microsoft.com/office/word/2020/wordml/sdtdatahash" xmlns:w16se="http://schemas.microsoft.com/office/word/2015/wordml/symex" xmlns:wpg="http://schemas.microsoft.com/office/word/2010/wordprocessingGroup" xmlns:wpi="http://schemas.microsoft.com/office/word/2010/wordprocessingInk" xmlns:wne="http://schemas.microsoft.com/office/word/2006/wordml" xmlns:wps="http://schemas.microsoft.com/office/word/2010/wordprocessingShape" mc:Ignorable="w14 w15 w16se w16cid w16 w16cex w16sdtdh wp14">
+<w:ftr xmlns:wpc="http://schemas.microsoft.com/office/word/2010/wordprocessingCanvas" xmlns:cx="http://schemas.microsoft.com/office/drawing/2014/chartex" xmlns:cx1="http://schemas.microsoft.com/office/drawing/2015/9/8/chartex" xmlns:cx2="http://schemas.microsoft.com/office/drawing/2015/10/21/chartex" xmlns:cx3="http://schemas.microsoft.com/office/drawing/2016/5/9/chartex" xmlns:cx4="http://schemas.microsoft.com/office/drawing/2016/5/10/chartex" xmlns:cx5="http://schemas.microsoft.com/office/drawing/2016/5/11/chartex" xmlns:cx6="http://schemas.microsoft.com/office/drawing/2016/5/12/chartex" xmlns:cx7="http://schemas.microsoft.com/office/drawing/2016/5/13/chartex" xmlns:cx8="http://schemas.microsoft.com/office/drawing/2016/5/14/chartex" xmlns:mc="http://schemas.openxmlformats.org/markup-compatibility/2006" xmlns:aink="http://schemas.microsoft.com/office/drawing/2016/ink" xmlns:am3d="http://schemas.microsoft.com/office/drawing/2017/model3d" xmlns:o="urn:schemas-microsoft-com:office:office" xmlns:oel="http://schemas.microsoft.com/office/2019/extlst" xmlns:r="http://schemas.openxmlformats.org/officeDocument/2006/relationships" xmlns:m="http://schemas.openxmlformats.org/officeDocument/2006/math" xmlns:v="urn:schemas-microsoft-com:vml" xmlns:wp14="http://schemas.microsoft.com/office/word/2010/wordprocessingDrawing" xmlns:wp="http://schemas.openxmlformats.org/drawingml/2006/wordprocessingDrawing" xmlns:w10="urn:schemas-microsoft-com:office:word" xmlns:w="http://schemas.openxmlformats.org/wordprocessingml/2006/main" xmlns:w14="http://schemas.microsoft.com/office/word/2010/wordml" xmlns:w15="http://schemas.microsoft.com/office/word/2012/wordml" xmlns:w16cex="http://schemas.microsoft.com/office/word/2018/wordml/cex" xmlns:w16cid="http://schemas.microsoft.com/office/word/2016/wordml/cid" xmlns:w16="http://schemas.microsoft.com/office/word/2018/wordml" xmlns:w16du="http://schemas.microsoft.com/office/word/2023/wordml/word16du" xmlns:w16sdtdh="http://schemas.microsoft.com/office/word/2020/wordml/sdtdatahash" xmlns:w16sdtfl="http://schemas.microsoft.com/office/word/2024/wordml/sdtformatlock" xmlns:w16se="http://schemas.microsoft.com/office/word/2015/wordml/symex" xmlns:wpg="http://schemas.microsoft.com/office/word/2010/wordprocessingGroup" xmlns:wpi="http://schemas.microsoft.com/office/word/2010/wordprocessingInk" xmlns:wne="http://schemas.microsoft.com/office/word/2006/wordml" xmlns:wps="http://schemas.microsoft.com/office/word/2010/wordprocessingShape" mc:Ignorable="w14 w15 w16se w16cid w16 w16cex w16sdtdh w16sdtfl w16du wp14">
   <w:p>
     <w:pPr>
       <w:pStyle w:val="Rodap"/>
@@ -5910,7 +6199,7 @@
 </file>
 
 <file path=word/footnotes.xml><?xml version="1.0" encoding="utf-8"?>
-<w:footnotes xmlns:wpc="http://schemas.microsoft.com/office/word/2010/wordprocessingCanvas" xmlns:cx="http://schemas.microsoft.com/office/drawing/2014/chartex" xmlns:cx1="http://schemas.microsoft.com/office/drawing/2015/9/8/chartex" xmlns:cx2="http://schemas.microsoft.com/office/drawing/2015/10/21/chartex" xmlns:cx3="http://schemas.microsoft.com/office/drawing/2016/5/9/chartex" xmlns:cx4="http://schemas.microsoft.com/office/drawing/2016/5/10/chartex" xmlns:cx5="http://schemas.microsoft.com/office/drawing/2016/5/11/chartex" xmlns:cx6="http://schemas.microsoft.com/office/drawing/2016/5/12/chartex" xmlns:cx7="http://schemas.microsoft.com/office/drawing/2016/5/13/chartex" xmlns:cx8="http://schemas.microsoft.com/office/drawing/2016/5/14/chartex" xmlns:mc="http://schemas.openxmlformats.org/markup-compatibility/2006" xmlns:aink="http://schemas.microsoft.com/office/drawing/2016/ink" xmlns:am3d="http://schemas.microsoft.com/office/drawing/2017/model3d" xmlns:o="urn:schemas-microsoft-com:office:office" xmlns:oel="http://schemas.microsoft.com/office/2019/extlst" xmlns:r="http://schemas.openxmlformats.org/officeDocument/2006/relationships" xmlns:m="http://schemas.openxmlformats.org/officeDocument/2006/math" xmlns:v="urn:schemas-microsoft-com:vml" xmlns:wp14="http://schemas.microsoft.com/office/word/2010/wordprocessingDrawing" xmlns:wp="http://schemas.openxmlformats.org/drawingml/2006/wordprocessingDrawing" xmlns:w10="urn:schemas-microsoft-com:office:word" xmlns:w="http://schemas.openxmlformats.org/wordprocessingml/2006/main" xmlns:w14="http://schemas.microsoft.com/office/word/2010/wordml" xmlns:w15="http://schemas.microsoft.com/office/word/2012/wordml" xmlns:w16cex="http://schemas.microsoft.com/office/word/2018/wordml/cex" xmlns:w16cid="http://schemas.microsoft.com/office/word/2016/wordml/cid" xmlns:w16="http://schemas.microsoft.com/office/word/2018/wordml" xmlns:w16sdtdh="http://schemas.microsoft.com/office/word/2020/wordml/sdtdatahash" xmlns:w16se="http://schemas.microsoft.com/office/word/2015/wordml/symex" xmlns:wpg="http://schemas.microsoft.com/office/word/2010/wordprocessingGroup" xmlns:wpi="http://schemas.microsoft.com/office/word/2010/wordprocessingInk" xmlns:wne="http://schemas.microsoft.com/office/word/2006/wordml" xmlns:wps="http://schemas.microsoft.com/office/word/2010/wordprocessingShape" mc:Ignorable="w14 w15 w16se w16cid w16 w16cex w16sdtdh wp14">
+<w:footnotes xmlns:wpc="http://schemas.microsoft.com/office/word/2010/wordprocessingCanvas" xmlns:cx="http://schemas.microsoft.com/office/drawing/2014/chartex" xmlns:cx1="http://schemas.microsoft.com/office/drawing/2015/9/8/chartex" xmlns:cx2="http://schemas.microsoft.com/office/drawing/2015/10/21/chartex" xmlns:cx3="http://schemas.microsoft.com/office/drawing/2016/5/9/chartex" xmlns:cx4="http://schemas.microsoft.com/office/drawing/2016/5/10/chartex" xmlns:cx5="http://schemas.microsoft.com/office/drawing/2016/5/11/chartex" xmlns:cx6="http://schemas.microsoft.com/office/drawing/2016/5/12/chartex" xmlns:cx7="http://schemas.microsoft.com/office/drawing/2016/5/13/chartex" xmlns:cx8="http://schemas.microsoft.com/office/drawing/2016/5/14/chartex" xmlns:mc="http://schemas.openxmlformats.org/markup-compatibility/2006" xmlns:aink="http://schemas.microsoft.com/office/drawing/2016/ink" xmlns:am3d="http://schemas.microsoft.com/office/drawing/2017/model3d" xmlns:o="urn:schemas-microsoft-com:office:office" xmlns:oel="http://schemas.microsoft.com/office/2019/extlst" xmlns:r="http://schemas.openxmlformats.org/officeDocument/2006/relationships" xmlns:m="http://schemas.openxmlformats.org/officeDocument/2006/math" xmlns:v="urn:schemas-microsoft-com:vml" xmlns:wp14="http://schemas.microsoft.com/office/word/2010/wordprocessingDrawing" xmlns:wp="http://schemas.openxmlformats.org/drawingml/2006/wordprocessingDrawing" xmlns:w10="urn:schemas-microsoft-com:office:word" xmlns:w="http://schemas.openxmlformats.org/wordprocessingml/2006/main" xmlns:w14="http://schemas.microsoft.com/office/word/2010/wordml" xmlns:w15="http://schemas.microsoft.com/office/word/2012/wordml" xmlns:w16cex="http://schemas.microsoft.com/office/word/2018/wordml/cex" xmlns:w16cid="http://schemas.microsoft.com/office/word/2016/wordml/cid" xmlns:w16="http://schemas.microsoft.com/office/word/2018/wordml" xmlns:w16du="http://schemas.microsoft.com/office/word/2023/wordml/word16du" xmlns:w16sdtdh="http://schemas.microsoft.com/office/word/2020/wordml/sdtdatahash" xmlns:w16sdtfl="http://schemas.microsoft.com/office/word/2024/wordml/sdtformatlock" xmlns:w16se="http://schemas.microsoft.com/office/word/2015/wordml/symex" xmlns:wpg="http://schemas.microsoft.com/office/word/2010/wordprocessingGroup" xmlns:wpi="http://schemas.microsoft.com/office/word/2010/wordprocessingInk" xmlns:wne="http://schemas.microsoft.com/office/word/2006/wordml" xmlns:wps="http://schemas.microsoft.com/office/word/2010/wordprocessingShape" mc:Ignorable="w14 w15 w16se w16cid w16 w16cex w16sdtdh w16sdtfl w16du wp14">
   <w:footnote w:type="separator" w:id="-1">
     <w:p>
       <w:r>
@@ -5929,7 +6218,7 @@
 </file>
 
 <file path=word/header1.xml><?xml version="1.0" encoding="utf-8"?>
-<w:hdr xmlns:wpc="http://schemas.microsoft.com/office/word/2010/wordprocessingCanvas" xmlns:cx="http://schemas.microsoft.com/office/drawing/2014/chartex" xmlns:cx1="http://schemas.microsoft.com/office/drawing/2015/9/8/chartex" xmlns:cx2="http://schemas.microsoft.com/office/drawing/2015/10/21/chartex" xmlns:cx3="http://schemas.microsoft.com/office/drawing/2016/5/9/chartex" xmlns:cx4="http://schemas.microsoft.com/office/drawing/2016/5/10/chartex" xmlns:cx5="http://schemas.microsoft.com/office/drawing/2016/5/11/chartex" xmlns:cx6="http://schemas.microsoft.com/office/drawing/2016/5/12/chartex" xmlns:cx7="http://schemas.microsoft.com/office/drawing/2016/5/13/chartex" xmlns:cx8="http://schemas.microsoft.com/office/drawing/2016/5/14/chartex" xmlns:mc="http://schemas.openxmlformats.org/markup-compatibility/2006" xmlns:aink="http://schemas.microsoft.com/office/drawing/2016/ink" xmlns:am3d="http://schemas.microsoft.com/office/drawing/2017/model3d" xmlns:o="urn:schemas-microsoft-com:office:office" xmlns:oel="http://schemas.microsoft.com/office/2019/extlst" xmlns:r="http://schemas.openxmlformats.org/officeDocument/2006/relationships" xmlns:m="http://schemas.openxmlformats.org/officeDocument/2006/math" xmlns:v="urn:schemas-microsoft-com:vml" xmlns:wp14="http://schemas.microsoft.com/office/word/2010/wordprocessingDrawing" xmlns:wp="http://schemas.openxmlformats.org/drawingml/2006/wordprocessingDrawing" xmlns:w10="urn:schemas-microsoft-com:office:word" xmlns:w="http://schemas.openxmlformats.org/wordprocessingml/2006/main" xmlns:w14="http://schemas.microsoft.com/office/word/2010/wordml" xmlns:w15="http://schemas.microsoft.com/office/word/2012/wordml" xmlns:w16cex="http://schemas.microsoft.com/office/word/2018/wordml/cex" xmlns:w16cid="http://schemas.microsoft.com/office/word/2016/wordml/cid" xmlns:w16="http://schemas.microsoft.com/office/word/2018/wordml" xmlns:w16sdtdh="http://schemas.microsoft.com/office/word/2020/wordml/sdtdatahash" xmlns:w16se="http://schemas.microsoft.com/office/word/2015/wordml/symex" xmlns:wpg="http://schemas.microsoft.com/office/word/2010/wordprocessingGroup" xmlns:wpi="http://schemas.microsoft.com/office/word/2010/wordprocessingInk" xmlns:wne="http://schemas.microsoft.com/office/word/2006/wordml" xmlns:wps="http://schemas.microsoft.com/office/word/2010/wordprocessingShape" mc:Ignorable="w14 w15 w16se w16cid w16 w16cex w16sdtdh wp14">
+<w:hdr xmlns:wpc="http://schemas.microsoft.com/office/word/2010/wordprocessingCanvas" xmlns:cx="http://schemas.microsoft.com/office/drawing/2014/chartex" xmlns:cx1="http://schemas.microsoft.com/office/drawing/2015/9/8/chartex" xmlns:cx2="http://schemas.microsoft.com/office/drawing/2015/10/21/chartex" xmlns:cx3="http://schemas.microsoft.com/office/drawing/2016/5/9/chartex" xmlns:cx4="http://schemas.microsoft.com/office/drawing/2016/5/10/chartex" xmlns:cx5="http://schemas.microsoft.com/office/drawing/2016/5/11/chartex" xmlns:cx6="http://schemas.microsoft.com/office/drawing/2016/5/12/chartex" xmlns:cx7="http://schemas.microsoft.com/office/drawing/2016/5/13/chartex" xmlns:cx8="http://schemas.microsoft.com/office/drawing/2016/5/14/chartex" xmlns:mc="http://schemas.openxmlformats.org/markup-compatibility/2006" xmlns:aink="http://schemas.microsoft.com/office/drawing/2016/ink" xmlns:am3d="http://schemas.microsoft.com/office/drawing/2017/model3d" xmlns:o="urn:schemas-microsoft-com:office:office" xmlns:oel="http://schemas.microsoft.com/office/2019/extlst" xmlns:r="http://schemas.openxmlformats.org/officeDocument/2006/relationships" xmlns:m="http://schemas.openxmlformats.org/officeDocument/2006/math" xmlns:v="urn:schemas-microsoft-com:vml" xmlns:wp14="http://schemas.microsoft.com/office/word/2010/wordprocessingDrawing" xmlns:wp="http://schemas.openxmlformats.org/drawingml/2006/wordprocessingDrawing" xmlns:w10="urn:schemas-microsoft-com:office:word" xmlns:w="http://schemas.openxmlformats.org/wordprocessingml/2006/main" xmlns:w14="http://schemas.microsoft.com/office/word/2010/wordml" xmlns:w15="http://schemas.microsoft.com/office/word/2012/wordml" xmlns:w16cex="http://schemas.microsoft.com/office/word/2018/wordml/cex" xmlns:w16cid="http://schemas.microsoft.com/office/word/2016/wordml/cid" xmlns:w16="http://schemas.microsoft.com/office/word/2018/wordml" xmlns:w16du="http://schemas.microsoft.com/office/word/2023/wordml/word16du" xmlns:w16sdtdh="http://schemas.microsoft.com/office/word/2020/wordml/sdtdatahash" xmlns:w16sdtfl="http://schemas.microsoft.com/office/word/2024/wordml/sdtformatlock" xmlns:w16se="http://schemas.microsoft.com/office/word/2015/wordml/symex" xmlns:wpg="http://schemas.microsoft.com/office/word/2010/wordprocessingGroup" xmlns:wpi="http://schemas.microsoft.com/office/word/2010/wordprocessingInk" xmlns:wne="http://schemas.microsoft.com/office/word/2006/wordml" xmlns:wps="http://schemas.microsoft.com/office/word/2010/wordprocessingShape" mc:Ignorable="w14 w15 w16se w16cid w16 w16cex w16sdtdh w16sdtfl w16du wp14">
   <w:p>
     <w:pPr>
       <w:pStyle w:val="Cabealho"/>
@@ -5939,7 +6228,7 @@
 </file>
 
 <file path=word/header2.xml><?xml version="1.0" encoding="utf-8"?>
-<w:hdr xmlns:wpc="http://schemas.microsoft.com/office/word/2010/wordprocessingCanvas" xmlns:cx="http://schemas.microsoft.com/office/drawing/2014/chartex" xmlns:cx1="http://schemas.microsoft.com/office/drawing/2015/9/8/chartex" xmlns:cx2="http://schemas.microsoft.com/office/drawing/2015/10/21/chartex" xmlns:cx3="http://schemas.microsoft.com/office/drawing/2016/5/9/chartex" xmlns:cx4="http://schemas.microsoft.com/office/drawing/2016/5/10/chartex" xmlns:cx5="http://schemas.microsoft.com/office/drawing/2016/5/11/chartex" xmlns:cx6="http://schemas.microsoft.com/office/drawing/2016/5/12/chartex" xmlns:cx7="http://schemas.microsoft.com/office/drawing/2016/5/13/chartex" xmlns:cx8="http://schemas.microsoft.com/office/drawing/2016/5/14/chartex" xmlns:mc="http://schemas.openxmlformats.org/markup-compatibility/2006" xmlns:aink="http://schemas.microsoft.com/office/drawing/2016/ink" xmlns:am3d="http://schemas.microsoft.com/office/drawing/2017/model3d" xmlns:o="urn:schemas-microsoft-com:office:office" xmlns:oel="http://schemas.microsoft.com/office/2019/extlst" xmlns:r="http://schemas.openxmlformats.org/officeDocument/2006/relationships" xmlns:m="http://schemas.openxmlformats.org/officeDocument/2006/math" xmlns:v="urn:schemas-microsoft-com:vml" xmlns:wp14="http://schemas.microsoft.com/office/word/2010/wordprocessingDrawing" xmlns:wp="http://schemas.openxmlformats.org/drawingml/2006/wordprocessingDrawing" xmlns:w10="urn:schemas-microsoft-com:office:word" xmlns:w="http://schemas.openxmlformats.org/wordprocessingml/2006/main" xmlns:w14="http://schemas.microsoft.com/office/word/2010/wordml" xmlns:w15="http://schemas.microsoft.com/office/word/2012/wordml" xmlns:w16cex="http://schemas.microsoft.com/office/word/2018/wordml/cex" xmlns:w16cid="http://schemas.microsoft.com/office/word/2016/wordml/cid" xmlns:w16="http://schemas.microsoft.com/office/word/2018/wordml" xmlns:w16sdtdh="http://schemas.microsoft.com/office/word/2020/wordml/sdtdatahash" xmlns:w16se="http://schemas.microsoft.com/office/word/2015/wordml/symex" xmlns:wpg="http://schemas.microsoft.com/office/word/2010/wordprocessingGroup" xmlns:wpi="http://schemas.microsoft.com/office/word/2010/wordprocessingInk" xmlns:wne="http://schemas.microsoft.com/office/word/2006/wordml" xmlns:wps="http://schemas.microsoft.com/office/word/2010/wordprocessingShape" mc:Ignorable="w14 w15 w16se w16cid w16 w16cex w16sdtdh wp14">
+<w:hdr xmlns:wpc="http://schemas.microsoft.com/office/word/2010/wordprocessingCanvas" xmlns:cx="http://schemas.microsoft.com/office/drawing/2014/chartex" xmlns:cx1="http://schemas.microsoft.com/office/drawing/2015/9/8/chartex" xmlns:cx2="http://schemas.microsoft.com/office/drawing/2015/10/21/chartex" xmlns:cx3="http://schemas.microsoft.com/office/drawing/2016/5/9/chartex" xmlns:cx4="http://schemas.microsoft.com/office/drawing/2016/5/10/chartex" xmlns:cx5="http://schemas.microsoft.com/office/drawing/2016/5/11/chartex" xmlns:cx6="http://schemas.microsoft.com/office/drawing/2016/5/12/chartex" xmlns:cx7="http://schemas.microsoft.com/office/drawing/2016/5/13/chartex" xmlns:cx8="http://schemas.microsoft.com/office/drawing/2016/5/14/chartex" xmlns:mc="http://schemas.openxmlformats.org/markup-compatibility/2006" xmlns:aink="http://schemas.microsoft.com/office/drawing/2016/ink" xmlns:am3d="http://schemas.microsoft.com/office/drawing/2017/model3d" xmlns:o="urn:schemas-microsoft-com:office:office" xmlns:oel="http://schemas.microsoft.com/office/2019/extlst" xmlns:r="http://schemas.openxmlformats.org/officeDocument/2006/relationships" xmlns:m="http://schemas.openxmlformats.org/officeDocument/2006/math" xmlns:v="urn:schemas-microsoft-com:vml" xmlns:wp14="http://schemas.microsoft.com/office/word/2010/wordprocessingDrawing" xmlns:wp="http://schemas.openxmlformats.org/drawingml/2006/wordprocessingDrawing" xmlns:w10="urn:schemas-microsoft-com:office:word" xmlns:w="http://schemas.openxmlformats.org/wordprocessingml/2006/main" xmlns:w14="http://schemas.microsoft.com/office/word/2010/wordml" xmlns:w15="http://schemas.microsoft.com/office/word/2012/wordml" xmlns:w16cex="http://schemas.microsoft.com/office/word/2018/wordml/cex" xmlns:w16cid="http://schemas.microsoft.com/office/word/2016/wordml/cid" xmlns:w16="http://schemas.microsoft.com/office/word/2018/wordml" xmlns:w16du="http://schemas.microsoft.com/office/word/2023/wordml/word16du" xmlns:w16sdtdh="http://schemas.microsoft.com/office/word/2020/wordml/sdtdatahash" xmlns:w16sdtfl="http://schemas.microsoft.com/office/word/2024/wordml/sdtformatlock" xmlns:w16se="http://schemas.microsoft.com/office/word/2015/wordml/symex" xmlns:wpg="http://schemas.microsoft.com/office/word/2010/wordprocessingGroup" xmlns:wpi="http://schemas.microsoft.com/office/word/2010/wordprocessingInk" xmlns:wne="http://schemas.microsoft.com/office/word/2006/wordml" xmlns:wps="http://schemas.microsoft.com/office/word/2010/wordprocessingShape" mc:Ignorable="w14 w15 w16se w16cid w16 w16cex w16sdtdh w16sdtfl w16du wp14">
   <w:tbl>
     <w:tblPr>
       <w:tblW w:w="9864" w:type="dxa"/>
@@ -5993,7 +6282,7 @@
 </file>
 
 <file path=word/header3.xml><?xml version="1.0" encoding="utf-8"?>
-<w:hdr xmlns:wpc="http://schemas.microsoft.com/office/word/2010/wordprocessingCanvas" xmlns:cx="http://schemas.microsoft.com/office/drawing/2014/chartex" xmlns:cx1="http://schemas.microsoft.com/office/drawing/2015/9/8/chartex" xmlns:cx2="http://schemas.microsoft.com/office/drawing/2015/10/21/chartex" xmlns:cx3="http://schemas.microsoft.com/office/drawing/2016/5/9/chartex" xmlns:cx4="http://schemas.microsoft.com/office/drawing/2016/5/10/chartex" xmlns:cx5="http://schemas.microsoft.com/office/drawing/2016/5/11/chartex" xmlns:cx6="http://schemas.microsoft.com/office/drawing/2016/5/12/chartex" xmlns:cx7="http://schemas.microsoft.com/office/drawing/2016/5/13/chartex" xmlns:cx8="http://schemas.microsoft.com/office/drawing/2016/5/14/chartex" xmlns:mc="http://schemas.openxmlformats.org/markup-compatibility/2006" xmlns:aink="http://schemas.microsoft.com/office/drawing/2016/ink" xmlns:am3d="http://schemas.microsoft.com/office/drawing/2017/model3d" xmlns:o="urn:schemas-microsoft-com:office:office" xmlns:oel="http://schemas.microsoft.com/office/2019/extlst" xmlns:r="http://schemas.openxmlformats.org/officeDocument/2006/relationships" xmlns:m="http://schemas.openxmlformats.org/officeDocument/2006/math" xmlns:v="urn:schemas-microsoft-com:vml" xmlns:wp14="http://schemas.microsoft.com/office/word/2010/wordprocessingDrawing" xmlns:wp="http://schemas.openxmlformats.org/drawingml/2006/wordprocessingDrawing" xmlns:w10="urn:schemas-microsoft-com:office:word" xmlns:w="http://schemas.openxmlformats.org/wordprocessingml/2006/main" xmlns:w14="http://schemas.microsoft.com/office/word/2010/wordml" xmlns:w15="http://schemas.microsoft.com/office/word/2012/wordml" xmlns:w16cex="http://schemas.microsoft.com/office/word/2018/wordml/cex" xmlns:w16cid="http://schemas.microsoft.com/office/word/2016/wordml/cid" xmlns:w16="http://schemas.microsoft.com/office/word/2018/wordml" xmlns:w16sdtdh="http://schemas.microsoft.com/office/word/2020/wordml/sdtdatahash" xmlns:w16se="http://schemas.microsoft.com/office/word/2015/wordml/symex" xmlns:wpg="http://schemas.microsoft.com/office/word/2010/wordprocessingGroup" xmlns:wpi="http://schemas.microsoft.com/office/word/2010/wordprocessingInk" xmlns:wne="http://schemas.microsoft.com/office/word/2006/wordml" xmlns:wps="http://schemas.microsoft.com/office/word/2010/wordprocessingShape" mc:Ignorable="w14 w15 w16se w16cid w16 w16cex w16sdtdh wp14">
+<w:hdr xmlns:wpc="http://schemas.microsoft.com/office/word/2010/wordprocessingCanvas" xmlns:cx="http://schemas.microsoft.com/office/drawing/2014/chartex" xmlns:cx1="http://schemas.microsoft.com/office/drawing/2015/9/8/chartex" xmlns:cx2="http://schemas.microsoft.com/office/drawing/2015/10/21/chartex" xmlns:cx3="http://schemas.microsoft.com/office/drawing/2016/5/9/chartex" xmlns:cx4="http://schemas.microsoft.com/office/drawing/2016/5/10/chartex" xmlns:cx5="http://schemas.microsoft.com/office/drawing/2016/5/11/chartex" xmlns:cx6="http://schemas.microsoft.com/office/drawing/2016/5/12/chartex" xmlns:cx7="http://schemas.microsoft.com/office/drawing/2016/5/13/chartex" xmlns:cx8="http://schemas.microsoft.com/office/drawing/2016/5/14/chartex" xmlns:mc="http://schemas.openxmlformats.org/markup-compatibility/2006" xmlns:aink="http://schemas.microsoft.com/office/drawing/2016/ink" xmlns:am3d="http://schemas.microsoft.com/office/drawing/2017/model3d" xmlns:o="urn:schemas-microsoft-com:office:office" xmlns:oel="http://schemas.microsoft.com/office/2019/extlst" xmlns:r="http://schemas.openxmlformats.org/officeDocument/2006/relationships" xmlns:m="http://schemas.openxmlformats.org/officeDocument/2006/math" xmlns:v="urn:schemas-microsoft-com:vml" xmlns:wp14="http://schemas.microsoft.com/office/word/2010/wordprocessingDrawing" xmlns:wp="http://schemas.openxmlformats.org/drawingml/2006/wordprocessingDrawing" xmlns:w10="urn:schemas-microsoft-com:office:word" xmlns:w="http://schemas.openxmlformats.org/wordprocessingml/2006/main" xmlns:w14="http://schemas.microsoft.com/office/word/2010/wordml" xmlns:w15="http://schemas.microsoft.com/office/word/2012/wordml" xmlns:w16cex="http://schemas.microsoft.com/office/word/2018/wordml/cex" xmlns:w16cid="http://schemas.microsoft.com/office/word/2016/wordml/cid" xmlns:w16="http://schemas.microsoft.com/office/word/2018/wordml" xmlns:w16du="http://schemas.microsoft.com/office/word/2023/wordml/word16du" xmlns:w16sdtdh="http://schemas.microsoft.com/office/word/2020/wordml/sdtdatahash" xmlns:w16sdtfl="http://schemas.microsoft.com/office/word/2024/wordml/sdtformatlock" xmlns:w16se="http://schemas.microsoft.com/office/word/2015/wordml/symex" xmlns:wpg="http://schemas.microsoft.com/office/word/2010/wordprocessingGroup" xmlns:wpi="http://schemas.microsoft.com/office/word/2010/wordprocessingInk" xmlns:wne="http://schemas.microsoft.com/office/word/2006/wordml" xmlns:wps="http://schemas.microsoft.com/office/word/2010/wordprocessingShape" mc:Ignorable="w14 w15 w16se w16cid w16 w16cex w16sdtdh w16sdtfl w16du wp14">
   <w:p>
     <w:pPr>
       <w:pStyle w:val="Cabealho"/>
@@ -6003,7 +6292,7 @@
 </file>
 
 <file path=word/numbering.xml><?xml version="1.0" encoding="utf-8"?>
-<w:numbering xmlns:wpc="http://schemas.microsoft.com/office/word/2010/wordprocessingCanvas" xmlns:cx="http://schemas.microsoft.com/office/drawing/2014/chartex" xmlns:cx1="http://schemas.microsoft.com/office/drawing/2015/9/8/chartex" xmlns:cx2="http://schemas.microsoft.com/office/drawing/2015/10/21/chartex" xmlns:cx3="http://schemas.microsoft.com/office/drawing/2016/5/9/chartex" xmlns:cx4="http://schemas.microsoft.com/office/drawing/2016/5/10/chartex" xmlns:cx5="http://schemas.microsoft.com/office/drawing/2016/5/11/chartex" xmlns:cx6="http://schemas.microsoft.com/office/drawing/2016/5/12/chartex" xmlns:cx7="http://schemas.microsoft.com/office/drawing/2016/5/13/chartex" xmlns:cx8="http://schemas.microsoft.com/office/drawing/2016/5/14/chartex" xmlns:mc="http://schemas.openxmlformats.org/markup-compatibility/2006" xmlns:aink="http://schemas.microsoft.com/office/drawing/2016/ink" xmlns:am3d="http://schemas.microsoft.com/office/drawing/2017/model3d" xmlns:o="urn:schemas-microsoft-com:office:office" xmlns:oel="http://schemas.microsoft.com/office/2019/extlst" xmlns:r="http://schemas.openxmlformats.org/officeDocument/2006/relationships" xmlns:m="http://schemas.openxmlformats.org/officeDocument/2006/math" xmlns:v="urn:schemas-microsoft-com:vml" xmlns:wp14="http://schemas.microsoft.com/office/word/2010/wordprocessingDrawing" xmlns:wp="http://schemas.openxmlformats.org/drawingml/2006/wordprocessingDrawing" xmlns:w10="urn:schemas-microsoft-com:office:word" xmlns:w="http://schemas.openxmlformats.org/wordprocessingml/2006/main" xmlns:w14="http://schemas.microsoft.com/office/word/2010/wordml" xmlns:w15="http://schemas.microsoft.com/office/word/2012/wordml" xmlns:w16cex="http://schemas.microsoft.com/office/word/2018/wordml/cex" xmlns:w16cid="http://schemas.microsoft.com/office/word/2016/wordml/cid" xmlns:w16="http://schemas.microsoft.com/office/word/2018/wordml" xmlns:w16sdtdh="http://schemas.microsoft.com/office/word/2020/wordml/sdtdatahash" xmlns:w16se="http://schemas.microsoft.com/office/word/2015/wordml/symex" xmlns:wpg="http://schemas.microsoft.com/office/word/2010/wordprocessingGroup" xmlns:wpi="http://schemas.microsoft.com/office/word/2010/wordprocessingInk" xmlns:wne="http://schemas.microsoft.com/office/word/2006/wordml" xmlns:wps="http://schemas.microsoft.com/office/word/2010/wordprocessingShape" mc:Ignorable="w14 w15 w16se w16cid w16 w16cex w16sdtdh wp14">
+<w:numbering xmlns:wpc="http://schemas.microsoft.com/office/word/2010/wordprocessingCanvas" xmlns:cx="http://schemas.microsoft.com/office/drawing/2014/chartex" xmlns:cx1="http://schemas.microsoft.com/office/drawing/2015/9/8/chartex" xmlns:cx2="http://schemas.microsoft.com/office/drawing/2015/10/21/chartex" xmlns:cx3="http://schemas.microsoft.com/office/drawing/2016/5/9/chartex" xmlns:cx4="http://schemas.microsoft.com/office/drawing/2016/5/10/chartex" xmlns:cx5="http://schemas.microsoft.com/office/drawing/2016/5/11/chartex" xmlns:cx6="http://schemas.microsoft.com/office/drawing/2016/5/12/chartex" xmlns:cx7="http://schemas.microsoft.com/office/drawing/2016/5/13/chartex" xmlns:cx8="http://schemas.microsoft.com/office/drawing/2016/5/14/chartex" xmlns:mc="http://schemas.openxmlformats.org/markup-compatibility/2006" xmlns:aink="http://schemas.microsoft.com/office/drawing/2016/ink" xmlns:am3d="http://schemas.microsoft.com/office/drawing/2017/model3d" xmlns:o="urn:schemas-microsoft-com:office:office" xmlns:oel="http://schemas.microsoft.com/office/2019/extlst" xmlns:r="http://schemas.openxmlformats.org/officeDocument/2006/relationships" xmlns:m="http://schemas.openxmlformats.org/officeDocument/2006/math" xmlns:v="urn:schemas-microsoft-com:vml" xmlns:wp14="http://schemas.microsoft.com/office/word/2010/wordprocessingDrawing" xmlns:wp="http://schemas.openxmlformats.org/drawingml/2006/wordprocessingDrawing" xmlns:w10="urn:schemas-microsoft-com:office:word" xmlns:w="http://schemas.openxmlformats.org/wordprocessingml/2006/main" xmlns:w14="http://schemas.microsoft.com/office/word/2010/wordml" xmlns:w15="http://schemas.microsoft.com/office/word/2012/wordml" xmlns:w16cex="http://schemas.microsoft.com/office/word/2018/wordml/cex" xmlns:w16cid="http://schemas.microsoft.com/office/word/2016/wordml/cid" xmlns:w16="http://schemas.microsoft.com/office/word/2018/wordml" xmlns:w16du="http://schemas.microsoft.com/office/word/2023/wordml/word16du" xmlns:w16sdtdh="http://schemas.microsoft.com/office/word/2020/wordml/sdtdatahash" xmlns:w16sdtfl="http://schemas.microsoft.com/office/word/2024/wordml/sdtformatlock" xmlns:w16se="http://schemas.microsoft.com/office/word/2015/wordml/symex" xmlns:wpg="http://schemas.microsoft.com/office/word/2010/wordprocessingGroup" xmlns:wpi="http://schemas.microsoft.com/office/word/2010/wordprocessingInk" xmlns:wne="http://schemas.microsoft.com/office/word/2006/wordml" xmlns:wps="http://schemas.microsoft.com/office/word/2010/wordprocessingShape" mc:Ignorable="w14 w15 w16se w16cid w16 w16cex w16sdtdh w16sdtfl w16du wp14">
   <w:abstractNum w:abstractNumId="0" w15:restartNumberingAfterBreak="0">
     <w:nsid w:val="00ED3AF5"/>
     <w:multiLevelType w:val="hybridMultilevel"/>
@@ -7081,7 +7370,7 @@
 </file>
 
 <file path=word/styles.xml><?xml version="1.0" encoding="utf-8"?>
-<w:styles xmlns:mc="http://schemas.openxmlformats.org/markup-compatibility/2006" xmlns:r="http://schemas.openxmlformats.org/officeDocument/2006/relationships" xmlns:w="http://schemas.openxmlformats.org/wordprocessingml/2006/main" xmlns:w14="http://schemas.microsoft.com/office/word/2010/wordml" xmlns:w15="http://schemas.microsoft.com/office/word/2012/wordml" xmlns:w16cex="http://schemas.microsoft.com/office/word/2018/wordml/cex" xmlns:w16cid="http://schemas.microsoft.com/office/word/2016/wordml/cid" xmlns:w16="http://schemas.microsoft.com/office/word/2018/wordml" xmlns:w16sdtdh="http://schemas.microsoft.com/office/word/2020/wordml/sdtdatahash" xmlns:w16se="http://schemas.microsoft.com/office/word/2015/wordml/symex" mc:Ignorable="w14 w15 w16se w16cid w16 w16cex w16sdtdh">
+<w:styles xmlns:mc="http://schemas.openxmlformats.org/markup-compatibility/2006" xmlns:r="http://schemas.openxmlformats.org/officeDocument/2006/relationships" xmlns:w="http://schemas.openxmlformats.org/wordprocessingml/2006/main" xmlns:w14="http://schemas.microsoft.com/office/word/2010/wordml" xmlns:w15="http://schemas.microsoft.com/office/word/2012/wordml" xmlns:w16cex="http://schemas.microsoft.com/office/word/2018/wordml/cex" xmlns:w16cid="http://schemas.microsoft.com/office/word/2016/wordml/cid" xmlns:w16="http://schemas.microsoft.com/office/word/2018/wordml" xmlns:w16du="http://schemas.microsoft.com/office/word/2023/wordml/word16du" xmlns:w16sdtdh="http://schemas.microsoft.com/office/word/2020/wordml/sdtdatahash" xmlns:w16sdtfl="http://schemas.microsoft.com/office/word/2024/wordml/sdtformatlock" xmlns:w16se="http://schemas.microsoft.com/office/word/2015/wordml/symex" mc:Ignorable="w14 w15 w16se w16cid w16 w16cex w16sdtdh w16sdtfl w16du">
   <w:docDefaults>
     <w:rPrDefault>
       <w:rPr>
@@ -7381,7 +7670,7 @@
     <w:qFormat/>
     <w:rsid w:val="009D28A0"/>
     <w:pPr>
-      <w:spacing w:after="100" w:line="259" w:lineRule="auto"/>
+      <w:spacing w:after="100" w:line="276" w:lineRule="auto"/>
     </w:pPr>
     <w:rPr>
       <w:sz w:val="21"/>
@@ -7397,7 +7686,7 @@
     <w:rsid w:val="00CD76E5"/>
     <w:pPr>
       <w:keepNext/>
-      <w:spacing w:before="200"/>
+      <w:spacing w:before="240" w:after="120"/>
       <w:outlineLvl w:val="0"/>
     </w:pPr>
     <w:rPr>
@@ -7417,7 +7706,7 @@
     <w:rsid w:val="00CD76E5"/>
     <w:pPr>
       <w:keepNext/>
-      <w:spacing w:before="140"/>
+      <w:spacing w:before="200" w:after="80"/>
       <w:outlineLvl w:val="1"/>
     </w:pPr>
     <w:rPr>
@@ -7438,7 +7727,7 @@
     <w:rsid w:val="00A7169B"/>
     <w:pPr>
       <w:keepNext/>
-      <w:spacing w:before="140"/>
+      <w:spacing w:before="160" w:after="60"/>
       <w:outlineLvl w:val="2"/>
     </w:pPr>
     <w:rPr>

</xml_diff>